<commit_message>
docs(submission): rebuild after the table of contents grew past one page
The three new 3.3 subsections pushed the contents list one line onto a second
page, leaving it nearly empty. Tighten the exact line spacing for TOC levels
1-3 so the full list fits on the single contents page again. Deliverable is
31 pages with no blank or near-empty page.
</commit_message>
<xml_diff>
--- a/docs/submission/VelaGuard-技术报告.docx
+++ b/docs/submission/VelaGuard-技术报告.docx
@@ -58,7 +58,7 @@
       <w:r>
         <w:fldChar w:fldCharType="separate"/>
       </w:r>
-      <w:hyperlink w:anchor="_Toc240384399" w:history="1">
+      <w:hyperlink w:anchor="_Toc240385749" w:history="1">
         <w:r>
           <w:rPr>
             <w:rStyle w:val="a5"/>
@@ -102,7 +102,7 @@
             <w:noProof/>
             <w:webHidden/>
           </w:rPr>
-          <w:instrText>PAGEREF _Toc240384399 \h</w:instrText>
+          <w:instrText>PAGEREF _Toc240385749 \h</w:instrText>
         </w:r>
         <w:r>
           <w:rPr>
@@ -132,7 +132,7 @@
             <w:noProof/>
             <w:webHidden/>
           </w:rPr>
-          <w:t>2</w:t>
+          <w:t>1</w:t>
         </w:r>
         <w:r>
           <w:rPr>
@@ -155,7 +155,7 @@
           <w14:ligatures w14:val="standardContextual"/>
         </w:rPr>
       </w:pPr>
-      <w:hyperlink w:anchor="_Toc240384400" w:history="1">
+      <w:hyperlink w:anchor="_Toc240385750" w:history="1">
         <w:r>
           <w:rPr>
             <w:rStyle w:val="a5"/>
@@ -199,7 +199,7 @@
             <w:noProof/>
             <w:webHidden/>
           </w:rPr>
-          <w:instrText>PAGEREF _Toc240384400 \h</w:instrText>
+          <w:instrText>PAGEREF _Toc240385750 \h</w:instrText>
         </w:r>
         <w:r>
           <w:rPr>
@@ -229,7 +229,7 @@
             <w:noProof/>
             <w:webHidden/>
           </w:rPr>
-          <w:t>2</w:t>
+          <w:t>1</w:t>
         </w:r>
         <w:r>
           <w:rPr>
@@ -252,7 +252,7 @@
           <w14:ligatures w14:val="standardContextual"/>
         </w:rPr>
       </w:pPr>
-      <w:hyperlink w:anchor="_Toc240384401" w:history="1">
+      <w:hyperlink w:anchor="_Toc240385751" w:history="1">
         <w:r>
           <w:rPr>
             <w:rStyle w:val="a5"/>
@@ -296,7 +296,7 @@
             <w:noProof/>
             <w:webHidden/>
           </w:rPr>
-          <w:instrText>PAGEREF _Toc240384401 \h</w:instrText>
+          <w:instrText>PAGEREF _Toc240385751 \h</w:instrText>
         </w:r>
         <w:r>
           <w:rPr>
@@ -326,7 +326,7 @@
             <w:noProof/>
             <w:webHidden/>
           </w:rPr>
-          <w:t>3</w:t>
+          <w:t>2</w:t>
         </w:r>
         <w:r>
           <w:rPr>
@@ -349,7 +349,7 @@
           <w14:ligatures w14:val="standardContextual"/>
         </w:rPr>
       </w:pPr>
-      <w:hyperlink w:anchor="_Toc240384402" w:history="1">
+      <w:hyperlink w:anchor="_Toc240385752" w:history="1">
         <w:r>
           <w:rPr>
             <w:rStyle w:val="a5"/>
@@ -393,7 +393,7 @@
             <w:noProof/>
             <w:webHidden/>
           </w:rPr>
-          <w:instrText>PAGEREF _Toc240384402 \h</w:instrText>
+          <w:instrText>PAGEREF _Toc240385752 \h</w:instrText>
         </w:r>
         <w:r>
           <w:rPr>
@@ -423,7 +423,7 @@
             <w:noProof/>
             <w:webHidden/>
           </w:rPr>
-          <w:t>3</w:t>
+          <w:t>2</w:t>
         </w:r>
         <w:r>
           <w:rPr>
@@ -447,7 +447,7 @@
           <w14:ligatures w14:val="standardContextual"/>
         </w:rPr>
       </w:pPr>
-      <w:hyperlink w:anchor="_Toc240384403" w:history="1">
+      <w:hyperlink w:anchor="_Toc240385753" w:history="1">
         <w:r>
           <w:rPr>
             <w:rStyle w:val="a5"/>
@@ -484,7 +484,7 @@
             <w:noProof/>
             <w:webHidden/>
           </w:rPr>
-          <w:instrText>PAGEREF _Toc240384403 \h</w:instrText>
+          <w:instrText>PAGEREF _Toc240385753 \h</w:instrText>
         </w:r>
         <w:r>
           <w:rPr>
@@ -514,7 +514,7 @@
             <w:noProof/>
             <w:webHidden/>
           </w:rPr>
-          <w:t>3</w:t>
+          <w:t>2</w:t>
         </w:r>
         <w:r>
           <w:rPr>
@@ -538,7 +538,7 @@
           <w14:ligatures w14:val="standardContextual"/>
         </w:rPr>
       </w:pPr>
-      <w:hyperlink w:anchor="_Toc240384404" w:history="1">
+      <w:hyperlink w:anchor="_Toc240385754" w:history="1">
         <w:r>
           <w:rPr>
             <w:rStyle w:val="a5"/>
@@ -575,7 +575,7 @@
             <w:noProof/>
             <w:webHidden/>
           </w:rPr>
-          <w:instrText>PAGEREF _Toc240384404 \h</w:instrText>
+          <w:instrText>PAGEREF _Toc240385754 \h</w:instrText>
         </w:r>
         <w:r>
           <w:rPr>
@@ -605,7 +605,7 @@
             <w:noProof/>
             <w:webHidden/>
           </w:rPr>
-          <w:t>3</w:t>
+          <w:t>2</w:t>
         </w:r>
         <w:r>
           <w:rPr>
@@ -629,7 +629,7 @@
           <w14:ligatures w14:val="standardContextual"/>
         </w:rPr>
       </w:pPr>
-      <w:hyperlink w:anchor="_Toc240384405" w:history="1">
+      <w:hyperlink w:anchor="_Toc240385755" w:history="1">
         <w:r>
           <w:rPr>
             <w:rStyle w:val="a5"/>
@@ -666,7 +666,7 @@
             <w:noProof/>
             <w:webHidden/>
           </w:rPr>
-          <w:instrText>PAGEREF _Toc240384405 \h</w:instrText>
+          <w:instrText>PAGEREF _Toc240385755 \h</w:instrText>
         </w:r>
         <w:r>
           <w:rPr>
@@ -696,7 +696,7 @@
             <w:noProof/>
             <w:webHidden/>
           </w:rPr>
-          <w:t>4</w:t>
+          <w:t>3</w:t>
         </w:r>
         <w:r>
           <w:rPr>
@@ -719,7 +719,7 @@
           <w14:ligatures w14:val="standardContextual"/>
         </w:rPr>
       </w:pPr>
-      <w:hyperlink w:anchor="_Toc240384406" w:history="1">
+      <w:hyperlink w:anchor="_Toc240385756" w:history="1">
         <w:r>
           <w:rPr>
             <w:rStyle w:val="a5"/>
@@ -763,7 +763,7 @@
             <w:noProof/>
             <w:webHidden/>
           </w:rPr>
-          <w:instrText>PAGEREF _Toc240384406 \h</w:instrText>
+          <w:instrText>PAGEREF _Toc240385756 \h</w:instrText>
         </w:r>
         <w:r>
           <w:rPr>
@@ -793,7 +793,7 @@
             <w:noProof/>
             <w:webHidden/>
           </w:rPr>
-          <w:t>5</w:t>
+          <w:t>4</w:t>
         </w:r>
         <w:r>
           <w:rPr>
@@ -817,7 +817,7 @@
           <w14:ligatures w14:val="standardContextual"/>
         </w:rPr>
       </w:pPr>
-      <w:hyperlink w:anchor="_Toc240384407" w:history="1">
+      <w:hyperlink w:anchor="_Toc240385757" w:history="1">
         <w:r>
           <w:rPr>
             <w:rStyle w:val="a5"/>
@@ -854,7 +854,7 @@
             <w:noProof/>
             <w:webHidden/>
           </w:rPr>
-          <w:instrText>PAGEREF _Toc240384407 \h</w:instrText>
+          <w:instrText>PAGEREF _Toc240385757 \h</w:instrText>
         </w:r>
         <w:r>
           <w:rPr>
@@ -884,7 +884,7 @@
             <w:noProof/>
             <w:webHidden/>
           </w:rPr>
-          <w:t>5</w:t>
+          <w:t>4</w:t>
         </w:r>
         <w:r>
           <w:rPr>
@@ -908,7 +908,7 @@
           <w14:ligatures w14:val="standardContextual"/>
         </w:rPr>
       </w:pPr>
-      <w:hyperlink w:anchor="_Toc240384408" w:history="1">
+      <w:hyperlink w:anchor="_Toc240385758" w:history="1">
         <w:r>
           <w:rPr>
             <w:rStyle w:val="a5"/>
@@ -945,7 +945,7 @@
             <w:noProof/>
             <w:webHidden/>
           </w:rPr>
-          <w:instrText>PAGEREF _Toc240384408 \h</w:instrText>
+          <w:instrText>PAGEREF _Toc240385758 \h</w:instrText>
         </w:r>
         <w:r>
           <w:rPr>
@@ -975,7 +975,7 @@
             <w:noProof/>
             <w:webHidden/>
           </w:rPr>
-          <w:t>6</w:t>
+          <w:t>5</w:t>
         </w:r>
         <w:r>
           <w:rPr>
@@ -999,7 +999,7 @@
           <w14:ligatures w14:val="standardContextual"/>
         </w:rPr>
       </w:pPr>
-      <w:hyperlink w:anchor="_Toc240384409" w:history="1">
+      <w:hyperlink w:anchor="_Toc240385759" w:history="1">
         <w:r>
           <w:rPr>
             <w:rStyle w:val="a5"/>
@@ -1036,7 +1036,7 @@
             <w:noProof/>
             <w:webHidden/>
           </w:rPr>
-          <w:instrText>PAGEREF _Toc240384409 \h</w:instrText>
+          <w:instrText>PAGEREF _Toc240385759 \h</w:instrText>
         </w:r>
         <w:r>
           <w:rPr>
@@ -1066,7 +1066,7 @@
             <w:noProof/>
             <w:webHidden/>
           </w:rPr>
-          <w:t>7</w:t>
+          <w:t>6</w:t>
         </w:r>
         <w:r>
           <w:rPr>
@@ -1089,7 +1089,7 @@
           <w14:ligatures w14:val="standardContextual"/>
         </w:rPr>
       </w:pPr>
-      <w:hyperlink w:anchor="_Toc240384410" w:history="1">
+      <w:hyperlink w:anchor="_Toc240385760" w:history="1">
         <w:r>
           <w:rPr>
             <w:rStyle w:val="a5"/>
@@ -1133,7 +1133,7 @@
             <w:noProof/>
             <w:webHidden/>
           </w:rPr>
-          <w:instrText>PAGEREF _Toc240384410 \h</w:instrText>
+          <w:instrText>PAGEREF _Toc240385760 \h</w:instrText>
         </w:r>
         <w:r>
           <w:rPr>
@@ -1163,7 +1163,7 @@
             <w:noProof/>
             <w:webHidden/>
           </w:rPr>
-          <w:t>8</w:t>
+          <w:t>7</w:t>
         </w:r>
         <w:r>
           <w:rPr>
@@ -1187,7 +1187,7 @@
           <w14:ligatures w14:val="standardContextual"/>
         </w:rPr>
       </w:pPr>
-      <w:hyperlink w:anchor="_Toc240384411" w:history="1">
+      <w:hyperlink w:anchor="_Toc240385761" w:history="1">
         <w:r>
           <w:rPr>
             <w:rStyle w:val="a5"/>
@@ -1231,7 +1231,7 @@
             <w:noProof/>
             <w:webHidden/>
           </w:rPr>
-          <w:instrText>PAGEREF _Toc240384411 \h</w:instrText>
+          <w:instrText>PAGEREF _Toc240385761 \h</w:instrText>
         </w:r>
         <w:r>
           <w:rPr>
@@ -1261,7 +1261,7 @@
             <w:noProof/>
             <w:webHidden/>
           </w:rPr>
-          <w:t>8</w:t>
+          <w:t>7</w:t>
         </w:r>
         <w:r>
           <w:rPr>
@@ -1285,7 +1285,7 @@
           <w14:ligatures w14:val="standardContextual"/>
         </w:rPr>
       </w:pPr>
-      <w:hyperlink w:anchor="_Toc240384412" w:history="1">
+      <w:hyperlink w:anchor="_Toc240385762" w:history="1">
         <w:r>
           <w:rPr>
             <w:rStyle w:val="a5"/>
@@ -1322,7 +1322,7 @@
             <w:noProof/>
             <w:webHidden/>
           </w:rPr>
-          <w:instrText>PAGEREF _Toc240384412 \h</w:instrText>
+          <w:instrText>PAGEREF _Toc240385762 \h</w:instrText>
         </w:r>
         <w:r>
           <w:rPr>
@@ -1352,7 +1352,7 @@
             <w:noProof/>
             <w:webHidden/>
           </w:rPr>
-          <w:t>9</w:t>
+          <w:t>8</w:t>
         </w:r>
         <w:r>
           <w:rPr>
@@ -1376,7 +1376,7 @@
           <w14:ligatures w14:val="standardContextual"/>
         </w:rPr>
       </w:pPr>
-      <w:hyperlink w:anchor="_Toc240384413" w:history="1">
+      <w:hyperlink w:anchor="_Toc240385763" w:history="1">
         <w:r>
           <w:rPr>
             <w:rStyle w:val="a5"/>
@@ -1413,7 +1413,7 @@
             <w:noProof/>
             <w:webHidden/>
           </w:rPr>
-          <w:instrText>PAGEREF _Toc240384413 \h</w:instrText>
+          <w:instrText>PAGEREF _Toc240385763 \h</w:instrText>
         </w:r>
         <w:r>
           <w:rPr>
@@ -1443,7 +1443,7 @@
             <w:noProof/>
             <w:webHidden/>
           </w:rPr>
-          <w:t>11</w:t>
+          <w:t>10</w:t>
         </w:r>
         <w:r>
           <w:rPr>
@@ -1467,7 +1467,7 @@
           <w14:ligatures w14:val="standardContextual"/>
         </w:rPr>
       </w:pPr>
-      <w:hyperlink w:anchor="_Toc240384414" w:history="1">
+      <w:hyperlink w:anchor="_Toc240385764" w:history="1">
         <w:r>
           <w:rPr>
             <w:rStyle w:val="a5"/>
@@ -1504,7 +1504,7 @@
             <w:noProof/>
             <w:webHidden/>
           </w:rPr>
-          <w:instrText>PAGEREF _Toc240384414 \h</w:instrText>
+          <w:instrText>PAGEREF _Toc240385764 \h</w:instrText>
         </w:r>
         <w:r>
           <w:rPr>
@@ -1534,7 +1534,7 @@
             <w:noProof/>
             <w:webHidden/>
           </w:rPr>
-          <w:t>12</w:t>
+          <w:t>11</w:t>
         </w:r>
         <w:r>
           <w:rPr>
@@ -1558,7 +1558,7 @@
           <w14:ligatures w14:val="standardContextual"/>
         </w:rPr>
       </w:pPr>
-      <w:hyperlink w:anchor="_Toc240384415" w:history="1">
+      <w:hyperlink w:anchor="_Toc240385765" w:history="1">
         <w:r>
           <w:rPr>
             <w:rStyle w:val="a5"/>
@@ -1595,7 +1595,7 @@
             <w:noProof/>
             <w:webHidden/>
           </w:rPr>
-          <w:instrText>PAGEREF _Toc240384415 \h</w:instrText>
+          <w:instrText>PAGEREF _Toc240385765 \h</w:instrText>
         </w:r>
         <w:r>
           <w:rPr>
@@ -1625,7 +1625,7 @@
             <w:noProof/>
             <w:webHidden/>
           </w:rPr>
-          <w:t>13</w:t>
+          <w:t>12</w:t>
         </w:r>
         <w:r>
           <w:rPr>
@@ -1649,7 +1649,7 @@
           <w14:ligatures w14:val="standardContextual"/>
         </w:rPr>
       </w:pPr>
-      <w:hyperlink w:anchor="_Toc240384416" w:history="1">
+      <w:hyperlink w:anchor="_Toc240385766" w:history="1">
         <w:r>
           <w:rPr>
             <w:rStyle w:val="a5"/>
@@ -1707,7 +1707,7 @@
             <w:noProof/>
             <w:webHidden/>
           </w:rPr>
-          <w:instrText>PAGEREF _Toc240384416 \h</w:instrText>
+          <w:instrText>PAGEREF _Toc240385766 \h</w:instrText>
         </w:r>
         <w:r>
           <w:rPr>
@@ -1737,7 +1737,7 @@
             <w:noProof/>
             <w:webHidden/>
           </w:rPr>
-          <w:t>13</w:t>
+          <w:t>12</w:t>
         </w:r>
         <w:r>
           <w:rPr>
@@ -1761,7 +1761,7 @@
           <w14:ligatures w14:val="standardContextual"/>
         </w:rPr>
       </w:pPr>
-      <w:hyperlink w:anchor="_Toc240384417" w:history="1">
+      <w:hyperlink w:anchor="_Toc240385767" w:history="1">
         <w:r>
           <w:rPr>
             <w:rStyle w:val="a5"/>
@@ -1805,7 +1805,7 @@
             <w:noProof/>
             <w:webHidden/>
           </w:rPr>
-          <w:instrText>PAGEREF _Toc240384417 \h</w:instrText>
+          <w:instrText>PAGEREF _Toc240385767 \h</w:instrText>
         </w:r>
         <w:r>
           <w:rPr>
@@ -1835,7 +1835,7 @@
             <w:noProof/>
             <w:webHidden/>
           </w:rPr>
-          <w:t>14</w:t>
+          <w:t>13</w:t>
         </w:r>
         <w:r>
           <w:rPr>
@@ -1858,7 +1858,7 @@
           <w14:ligatures w14:val="standardContextual"/>
         </w:rPr>
       </w:pPr>
-      <w:hyperlink w:anchor="_Toc240384418" w:history="1">
+      <w:hyperlink w:anchor="_Toc240385768" w:history="1">
         <w:r>
           <w:rPr>
             <w:rStyle w:val="a5"/>
@@ -1902,7 +1902,7 @@
             <w:noProof/>
             <w:webHidden/>
           </w:rPr>
-          <w:instrText>PAGEREF _Toc240384418 \h</w:instrText>
+          <w:instrText>PAGEREF _Toc240385768 \h</w:instrText>
         </w:r>
         <w:r>
           <w:rPr>
@@ -1932,7 +1932,7 @@
             <w:noProof/>
             <w:webHidden/>
           </w:rPr>
-          <w:t>15</w:t>
+          <w:t>14</w:t>
         </w:r>
         <w:r>
           <w:rPr>
@@ -1956,7 +1956,7 @@
           <w14:ligatures w14:val="standardContextual"/>
         </w:rPr>
       </w:pPr>
-      <w:hyperlink w:anchor="_Toc240384419" w:history="1">
+      <w:hyperlink w:anchor="_Toc240385769" w:history="1">
         <w:r>
           <w:rPr>
             <w:rStyle w:val="a5"/>
@@ -1993,7 +1993,7 @@
             <w:noProof/>
             <w:webHidden/>
           </w:rPr>
-          <w:instrText>PAGEREF _Toc240384419 \h</w:instrText>
+          <w:instrText>PAGEREF _Toc240385769 \h</w:instrText>
         </w:r>
         <w:r>
           <w:rPr>
@@ -2023,7 +2023,7 @@
             <w:noProof/>
             <w:webHidden/>
           </w:rPr>
-          <w:t>15</w:t>
+          <w:t>14</w:t>
         </w:r>
         <w:r>
           <w:rPr>
@@ -2047,7 +2047,7 @@
           <w14:ligatures w14:val="standardContextual"/>
         </w:rPr>
       </w:pPr>
-      <w:hyperlink w:anchor="_Toc240384420" w:history="1">
+      <w:hyperlink w:anchor="_Toc240385770" w:history="1">
         <w:r>
           <w:rPr>
             <w:rStyle w:val="a5"/>
@@ -2084,7 +2084,7 @@
             <w:noProof/>
             <w:webHidden/>
           </w:rPr>
-          <w:instrText>PAGEREF _Toc240384420 \h</w:instrText>
+          <w:instrText>PAGEREF _Toc240385770 \h</w:instrText>
         </w:r>
         <w:r>
           <w:rPr>
@@ -2114,7 +2114,7 @@
             <w:noProof/>
             <w:webHidden/>
           </w:rPr>
-          <w:t>16</w:t>
+          <w:t>15</w:t>
         </w:r>
         <w:r>
           <w:rPr>
@@ -2138,7 +2138,7 @@
           <w14:ligatures w14:val="standardContextual"/>
         </w:rPr>
       </w:pPr>
-      <w:hyperlink w:anchor="_Toc240384421" w:history="1">
+      <w:hyperlink w:anchor="_Toc240385771" w:history="1">
         <w:r>
           <w:rPr>
             <w:rStyle w:val="a5"/>
@@ -2175,7 +2175,7 @@
             <w:noProof/>
             <w:webHidden/>
           </w:rPr>
-          <w:instrText>PAGEREF _Toc240384421 \h</w:instrText>
+          <w:instrText>PAGEREF _Toc240385771 \h</w:instrText>
         </w:r>
         <w:r>
           <w:rPr>
@@ -2205,7 +2205,7 @@
             <w:noProof/>
             <w:webHidden/>
           </w:rPr>
-          <w:t>18</w:t>
+          <w:t>17</w:t>
         </w:r>
         <w:r>
           <w:rPr>
@@ -2229,7 +2229,7 @@
           <w14:ligatures w14:val="standardContextual"/>
         </w:rPr>
       </w:pPr>
-      <w:hyperlink w:anchor="_Toc240384422" w:history="1">
+      <w:hyperlink w:anchor="_Toc240385772" w:history="1">
         <w:r>
           <w:rPr>
             <w:rStyle w:val="a5"/>
@@ -2273,7 +2273,7 @@
             <w:noProof/>
             <w:webHidden/>
           </w:rPr>
-          <w:instrText>PAGEREF _Toc240384422 \h</w:instrText>
+          <w:instrText>PAGEREF _Toc240385772 \h</w:instrText>
         </w:r>
         <w:r>
           <w:rPr>
@@ -2303,7 +2303,7 @@
             <w:noProof/>
             <w:webHidden/>
           </w:rPr>
-          <w:t>20</w:t>
+          <w:t>19</w:t>
         </w:r>
         <w:r>
           <w:rPr>
@@ -2327,7 +2327,7 @@
           <w14:ligatures w14:val="standardContextual"/>
         </w:rPr>
       </w:pPr>
-      <w:hyperlink w:anchor="_Toc240384423" w:history="1">
+      <w:hyperlink w:anchor="_Toc240385773" w:history="1">
         <w:r>
           <w:rPr>
             <w:rStyle w:val="a5"/>
@@ -2364,7 +2364,7 @@
             <w:noProof/>
             <w:webHidden/>
           </w:rPr>
-          <w:instrText>PAGEREF _Toc240384423 \h</w:instrText>
+          <w:instrText>PAGEREF _Toc240385773 \h</w:instrText>
         </w:r>
         <w:r>
           <w:rPr>
@@ -2394,7 +2394,7 @@
             <w:noProof/>
             <w:webHidden/>
           </w:rPr>
-          <w:t>22</w:t>
+          <w:t>21</w:t>
         </w:r>
         <w:r>
           <w:rPr>
@@ -2418,7 +2418,7 @@
           <w14:ligatures w14:val="standardContextual"/>
         </w:rPr>
       </w:pPr>
-      <w:hyperlink w:anchor="_Toc240384424" w:history="1">
+      <w:hyperlink w:anchor="_Toc240385774" w:history="1">
         <w:r>
           <w:rPr>
             <w:rStyle w:val="a5"/>
@@ -2455,7 +2455,7 @@
             <w:noProof/>
             <w:webHidden/>
           </w:rPr>
-          <w:instrText>PAGEREF _Toc240384424 \h</w:instrText>
+          <w:instrText>PAGEREF _Toc240385774 \h</w:instrText>
         </w:r>
         <w:r>
           <w:rPr>
@@ -2485,7 +2485,7 @@
             <w:noProof/>
             <w:webHidden/>
           </w:rPr>
-          <w:t>23</w:t>
+          <w:t>22</w:t>
         </w:r>
         <w:r>
           <w:rPr>
@@ -2508,7 +2508,7 @@
           <w14:ligatures w14:val="standardContextual"/>
         </w:rPr>
       </w:pPr>
-      <w:hyperlink w:anchor="_Toc240384425" w:history="1">
+      <w:hyperlink w:anchor="_Toc240385775" w:history="1">
         <w:r>
           <w:rPr>
             <w:rStyle w:val="a5"/>
@@ -2552,7 +2552,7 @@
             <w:noProof/>
             <w:webHidden/>
           </w:rPr>
-          <w:instrText>PAGEREF _Toc240384425 \h</w:instrText>
+          <w:instrText>PAGEREF _Toc240385775 \h</w:instrText>
         </w:r>
         <w:r>
           <w:rPr>
@@ -2582,7 +2582,7 @@
             <w:noProof/>
             <w:webHidden/>
           </w:rPr>
-          <w:t>25</w:t>
+          <w:t>24</w:t>
         </w:r>
         <w:r>
           <w:rPr>
@@ -2606,7 +2606,7 @@
           <w14:ligatures w14:val="standardContextual"/>
         </w:rPr>
       </w:pPr>
-      <w:hyperlink w:anchor="_Toc240384426" w:history="1">
+      <w:hyperlink w:anchor="_Toc240385776" w:history="1">
         <w:r>
           <w:rPr>
             <w:rStyle w:val="a5"/>
@@ -2643,7 +2643,7 @@
             <w:noProof/>
             <w:webHidden/>
           </w:rPr>
-          <w:instrText>PAGEREF _Toc240384426 \h</w:instrText>
+          <w:instrText>PAGEREF _Toc240385776 \h</w:instrText>
         </w:r>
         <w:r>
           <w:rPr>
@@ -2673,7 +2673,7 @@
             <w:noProof/>
             <w:webHidden/>
           </w:rPr>
-          <w:t>25</w:t>
+          <w:t>24</w:t>
         </w:r>
         <w:r>
           <w:rPr>
@@ -2697,7 +2697,7 @@
           <w14:ligatures w14:val="standardContextual"/>
         </w:rPr>
       </w:pPr>
-      <w:hyperlink w:anchor="_Toc240384427" w:history="1">
+      <w:hyperlink w:anchor="_Toc240385777" w:history="1">
         <w:r>
           <w:rPr>
             <w:rStyle w:val="a5"/>
@@ -2734,7 +2734,7 @@
             <w:noProof/>
             <w:webHidden/>
           </w:rPr>
-          <w:instrText>PAGEREF _Toc240384427 \h</w:instrText>
+          <w:instrText>PAGEREF _Toc240385777 \h</w:instrText>
         </w:r>
         <w:r>
           <w:rPr>
@@ -2764,7 +2764,7 @@
             <w:noProof/>
             <w:webHidden/>
           </w:rPr>
-          <w:t>26</w:t>
+          <w:t>25</w:t>
         </w:r>
         <w:r>
           <w:rPr>
@@ -2788,7 +2788,7 @@
           <w14:ligatures w14:val="standardContextual"/>
         </w:rPr>
       </w:pPr>
-      <w:hyperlink w:anchor="_Toc240384428" w:history="1">
+      <w:hyperlink w:anchor="_Toc240385778" w:history="1">
         <w:r>
           <w:rPr>
             <w:rStyle w:val="a5"/>
@@ -2832,7 +2832,7 @@
             <w:noProof/>
             <w:webHidden/>
           </w:rPr>
-          <w:instrText>PAGEREF _Toc240384428 \h</w:instrText>
+          <w:instrText>PAGEREF _Toc240385778 \h</w:instrText>
         </w:r>
         <w:r>
           <w:rPr>
@@ -2862,7 +2862,7 @@
             <w:noProof/>
             <w:webHidden/>
           </w:rPr>
-          <w:t>26</w:t>
+          <w:t>25</w:t>
         </w:r>
         <w:r>
           <w:rPr>
@@ -2886,7 +2886,7 @@
           <w14:ligatures w14:val="standardContextual"/>
         </w:rPr>
       </w:pPr>
-      <w:hyperlink w:anchor="_Toc240384429" w:history="1">
+      <w:hyperlink w:anchor="_Toc240385779" w:history="1">
         <w:r>
           <w:rPr>
             <w:rStyle w:val="a5"/>
@@ -2923,7 +2923,7 @@
             <w:noProof/>
             <w:webHidden/>
           </w:rPr>
-          <w:instrText>PAGEREF _Toc240384429 \h</w:instrText>
+          <w:instrText>PAGEREF _Toc240385779 \h</w:instrText>
         </w:r>
         <w:r>
           <w:rPr>
@@ -2953,7 +2953,7 @@
             <w:noProof/>
             <w:webHidden/>
           </w:rPr>
-          <w:t>27</w:t>
+          <w:t>26</w:t>
         </w:r>
         <w:r>
           <w:rPr>
@@ -2976,7 +2976,7 @@
           <w14:ligatures w14:val="standardContextual"/>
         </w:rPr>
       </w:pPr>
-      <w:hyperlink w:anchor="_Toc240384430" w:history="1">
+      <w:hyperlink w:anchor="_Toc240385780" w:history="1">
         <w:r>
           <w:rPr>
             <w:rStyle w:val="a5"/>
@@ -3020,7 +3020,7 @@
             <w:noProof/>
             <w:webHidden/>
           </w:rPr>
-          <w:instrText>PAGEREF _Toc240384430 \h</w:instrText>
+          <w:instrText>PAGEREF _Toc240385780 \h</w:instrText>
         </w:r>
         <w:r>
           <w:rPr>
@@ -3050,7 +3050,7 @@
             <w:noProof/>
             <w:webHidden/>
           </w:rPr>
-          <w:t>27</w:t>
+          <w:t>26</w:t>
         </w:r>
         <w:r>
           <w:rPr>
@@ -3074,7 +3074,7 @@
           <w14:ligatures w14:val="standardContextual"/>
         </w:rPr>
       </w:pPr>
-      <w:hyperlink w:anchor="_Toc240384431" w:history="1">
+      <w:hyperlink w:anchor="_Toc240385781" w:history="1">
         <w:r>
           <w:rPr>
             <w:rStyle w:val="a5"/>
@@ -3111,7 +3111,7 @@
             <w:noProof/>
             <w:webHidden/>
           </w:rPr>
-          <w:instrText>PAGEREF _Toc240384431 \h</w:instrText>
+          <w:instrText>PAGEREF _Toc240385781 \h</w:instrText>
         </w:r>
         <w:r>
           <w:rPr>
@@ -3141,7 +3141,7 @@
             <w:noProof/>
             <w:webHidden/>
           </w:rPr>
-          <w:t>28</w:t>
+          <w:t>27</w:t>
         </w:r>
         <w:r>
           <w:rPr>
@@ -3164,7 +3164,7 @@
           <w14:ligatures w14:val="standardContextual"/>
         </w:rPr>
       </w:pPr>
-      <w:hyperlink w:anchor="_Toc240384432" w:history="1">
+      <w:hyperlink w:anchor="_Toc240385782" w:history="1">
         <w:r>
           <w:rPr>
             <w:rStyle w:val="a5"/>
@@ -3208,7 +3208,7 @@
             <w:noProof/>
             <w:webHidden/>
           </w:rPr>
-          <w:instrText>PAGEREF _Toc240384432 \h</w:instrText>
+          <w:instrText>PAGEREF _Toc240385782 \h</w:instrText>
         </w:r>
         <w:r>
           <w:rPr>
@@ -3238,7 +3238,7 @@
             <w:noProof/>
             <w:webHidden/>
           </w:rPr>
-          <w:t>29</w:t>
+          <w:t>28</w:t>
         </w:r>
         <w:r>
           <w:rPr>
@@ -3262,7 +3262,7 @@
           <w14:ligatures w14:val="standardContextual"/>
         </w:rPr>
       </w:pPr>
-      <w:hyperlink w:anchor="_Toc240384433" w:history="1">
+      <w:hyperlink w:anchor="_Toc240385783" w:history="1">
         <w:r>
           <w:rPr>
             <w:rStyle w:val="a5"/>
@@ -3299,7 +3299,7 @@
             <w:noProof/>
             <w:webHidden/>
           </w:rPr>
-          <w:instrText>PAGEREF _Toc240384433 \h</w:instrText>
+          <w:instrText>PAGEREF _Toc240385783 \h</w:instrText>
         </w:r>
         <w:r>
           <w:rPr>
@@ -3329,7 +3329,7 @@
             <w:noProof/>
             <w:webHidden/>
           </w:rPr>
-          <w:t>29</w:t>
+          <w:t>28</w:t>
         </w:r>
         <w:r>
           <w:rPr>
@@ -3353,7 +3353,7 @@
           <w14:ligatures w14:val="standardContextual"/>
         </w:rPr>
       </w:pPr>
-      <w:hyperlink w:anchor="_Toc240384434" w:history="1">
+      <w:hyperlink w:anchor="_Toc240385784" w:history="1">
         <w:r>
           <w:rPr>
             <w:rStyle w:val="a5"/>
@@ -3390,7 +3390,7 @@
             <w:noProof/>
             <w:webHidden/>
           </w:rPr>
-          <w:instrText>PAGEREF _Toc240384434 \h</w:instrText>
+          <w:instrText>PAGEREF _Toc240385784 \h</w:instrText>
         </w:r>
         <w:r>
           <w:rPr>
@@ -3420,7 +3420,7 @@
             <w:noProof/>
             <w:webHidden/>
           </w:rPr>
-          <w:t>29</w:t>
+          <w:t>28</w:t>
         </w:r>
         <w:r>
           <w:rPr>
@@ -3444,7 +3444,7 @@
           <w14:ligatures w14:val="standardContextual"/>
         </w:rPr>
       </w:pPr>
-      <w:hyperlink w:anchor="_Toc240384435" w:history="1">
+      <w:hyperlink w:anchor="_Toc240385785" w:history="1">
         <w:r>
           <w:rPr>
             <w:rStyle w:val="a5"/>
@@ -3481,7 +3481,7 @@
             <w:noProof/>
             <w:webHidden/>
           </w:rPr>
-          <w:instrText>PAGEREF _Toc240384435 \h</w:instrText>
+          <w:instrText>PAGEREF _Toc240385785 \h</w:instrText>
         </w:r>
         <w:r>
           <w:rPr>
@@ -3511,7 +3511,7 @@
             <w:noProof/>
             <w:webHidden/>
           </w:rPr>
-          <w:t>30</w:t>
+          <w:t>29</w:t>
         </w:r>
         <w:r>
           <w:rPr>
@@ -3535,7 +3535,7 @@
           <w14:ligatures w14:val="standardContextual"/>
         </w:rPr>
       </w:pPr>
-      <w:hyperlink w:anchor="_Toc240384436" w:history="1">
+      <w:hyperlink w:anchor="_Toc240385786" w:history="1">
         <w:r>
           <w:rPr>
             <w:rStyle w:val="a5"/>
@@ -3572,7 +3572,7 @@
             <w:noProof/>
             <w:webHidden/>
           </w:rPr>
-          <w:instrText>PAGEREF _Toc240384436 \h</w:instrText>
+          <w:instrText>PAGEREF _Toc240385786 \h</w:instrText>
         </w:r>
         <w:r>
           <w:rPr>
@@ -3602,7 +3602,7 @@
             <w:noProof/>
             <w:webHidden/>
           </w:rPr>
-          <w:t>31</w:t>
+          <w:t>30</w:t>
         </w:r>
         <w:r>
           <w:rPr>
@@ -3628,7 +3628,7 @@
         <w:pStyle w:val="1"/>
         <w:pageBreakBefore/>
       </w:pPr>
-      <w:bookmarkStart w:id="0" w:name="_Toc240384399"/>
+      <w:bookmarkStart w:id="0" w:name="_Toc240385749"/>
       <w:r>
         <w:lastRenderedPageBreak/>
         <w:t>1</w:t>
@@ -3657,7 +3657,7 @@
           <w:bottom w:w="40" w:type="dxa"/>
           <w:right w:w="113" w:type="dxa"/>
         </w:tblCellMar>
-        <w:tblLook w:val="0000" w:firstRow="0" w:lastRow="0" w:firstColumn="0" w:lastColumn="0" w:noHBand="0" w:noVBand="0"/>
+        <w:tblLook w:val="04A0" w:firstRow="1" w:lastRow="0" w:firstColumn="1" w:lastColumn="0" w:noHBand="0" w:noVBand="1"/>
       </w:tblPr>
       <w:tblGrid>
         <w:gridCol w:w="2122"/>
@@ -3927,7 +3927,7 @@
       <w:pPr>
         <w:pStyle w:val="1"/>
       </w:pPr>
-      <w:bookmarkStart w:id="1" w:name="_Toc240384400"/>
+      <w:bookmarkStart w:id="1" w:name="_Toc240385750"/>
       <w:r>
         <w:t>2</w:t>
       </w:r>
@@ -4082,7 +4082,7 @@
         <w:pStyle w:val="1"/>
         <w:pageBreakBefore/>
       </w:pPr>
-      <w:bookmarkStart w:id="2" w:name="_Toc240384401"/>
+      <w:bookmarkStart w:id="2" w:name="_Toc240385751"/>
       <w:r>
         <w:lastRenderedPageBreak/>
         <w:t>3</w:t>
@@ -4096,7 +4096,7 @@
       <w:pPr>
         <w:pStyle w:val="2"/>
       </w:pPr>
-      <w:bookmarkStart w:id="3" w:name="_Toc240384402"/>
+      <w:bookmarkStart w:id="3" w:name="_Toc240385752"/>
       <w:r>
         <w:t xml:space="preserve">3.1 </w:t>
       </w:r>
@@ -4109,7 +4109,7 @@
       <w:pPr>
         <w:pStyle w:val="3"/>
       </w:pPr>
-      <w:bookmarkStart w:id="4" w:name="_Toc240384403"/>
+      <w:bookmarkStart w:id="4" w:name="_Toc240385753"/>
       <w:r>
         <w:t>项目背景与问题定义</w:t>
       </w:r>
@@ -4183,7 +4183,7 @@
       <w:pPr>
         <w:pStyle w:val="3"/>
       </w:pPr>
-      <w:bookmarkStart w:id="5" w:name="_Toc240384404"/>
+      <w:bookmarkStart w:id="5" w:name="_Toc240385754"/>
       <w:r>
         <w:t>技术难点</w:t>
       </w:r>
@@ -4439,7 +4439,7 @@
       <w:pPr>
         <w:pStyle w:val="3"/>
       </w:pPr>
-      <w:bookmarkStart w:id="6" w:name="_Toc240384405"/>
+      <w:bookmarkStart w:id="6" w:name="_Toc240385755"/>
       <w:r>
         <w:t>创新点</w:t>
       </w:r>
@@ -4614,7 +4614,7 @@
       <w:pPr>
         <w:pStyle w:val="2"/>
       </w:pPr>
-      <w:bookmarkStart w:id="7" w:name="_Toc240384406"/>
+      <w:bookmarkStart w:id="7" w:name="_Toc240385756"/>
       <w:r>
         <w:t xml:space="preserve">3.2 </w:t>
       </w:r>
@@ -4627,7 +4627,7 @@
       <w:pPr>
         <w:pStyle w:val="3"/>
       </w:pPr>
-      <w:bookmarkStart w:id="8" w:name="_Toc240384407"/>
+      <w:bookmarkStart w:id="8" w:name="_Toc240385757"/>
       <w:r>
         <w:t>系统总体架构</w:t>
       </w:r>
@@ -4729,7 +4729,7 @@
         </w:rPr>
         <w:lastRenderedPageBreak/>
         <w:drawing>
-          <wp:inline distT="0" distB="0" distL="0" distR="0" wp14:anchorId="645C9C7B" wp14:editId="4FEBFF50">
+          <wp:inline distT="0" distB="0" distL="0" distR="0" wp14:anchorId="5755F52C" wp14:editId="17AB8050">
             <wp:extent cx="5615940" cy="3275965"/>
             <wp:effectExtent l="0" t="0" r="0" b="0"/>
             <wp:docPr id="1" name="Picture 1" descr="图 1  系统总体架构：现场、板端与云端的职责分工"/>
@@ -4783,7 +4783,7 @@
       <w:pPr>
         <w:pStyle w:val="3"/>
       </w:pPr>
-      <w:bookmarkStart w:id="9" w:name="_Toc240384408"/>
+      <w:bookmarkStart w:id="9" w:name="_Toc240385758"/>
       <w:r>
         <w:t>方案论证与选型</w:t>
       </w:r>
@@ -5072,7 +5072,7 @@
       <w:pPr>
         <w:pStyle w:val="3"/>
       </w:pPr>
-      <w:bookmarkStart w:id="10" w:name="_Toc240384409"/>
+      <w:bookmarkStart w:id="10" w:name="_Toc240385759"/>
       <w:r>
         <w:t>关键模块设计</w:t>
       </w:r>
@@ -5817,7 +5817,7 @@
           <w:noProof/>
         </w:rPr>
         <w:drawing>
-          <wp:inline distT="0" distB="0" distL="0" distR="0" wp14:anchorId="2BAE8EBC" wp14:editId="62A680A3">
+          <wp:inline distT="0" distB="0" distL="0" distR="0" wp14:anchorId="2966430C" wp14:editId="5326EFDC">
             <wp:extent cx="5615940" cy="3182366"/>
             <wp:effectExtent l="0" t="0" r="0" b="0"/>
             <wp:docPr id="2" name="Picture 2" descr="图 2  板端首页：32 个点位的快照与状态栏"/>
@@ -5944,7 +5944,7 @@
       <w:pPr>
         <w:pStyle w:val="2"/>
       </w:pPr>
-      <w:bookmarkStart w:id="11" w:name="_Toc240384410"/>
+      <w:bookmarkStart w:id="11" w:name="_Toc240385760"/>
       <w:r>
         <w:t xml:space="preserve">3.3 </w:t>
       </w:r>
@@ -5957,7 +5957,7 @@
       <w:pPr>
         <w:pStyle w:val="3"/>
       </w:pPr>
-      <w:bookmarkStart w:id="12" w:name="_Toc240384411"/>
+      <w:bookmarkStart w:id="12" w:name="_Toc240385761"/>
       <w:r>
         <w:t xml:space="preserve">openvelaClaw </w:t>
       </w:r>
@@ -6099,7 +6099,7 @@
       <w:pPr>
         <w:pStyle w:val="3"/>
       </w:pPr>
-      <w:bookmarkStart w:id="13" w:name="_Toc240384412"/>
+      <w:bookmarkStart w:id="13" w:name="_Toc240385762"/>
       <w:r>
         <w:t>阈值与离线的确定性判定</w:t>
       </w:r>
@@ -6287,7 +6287,7 @@
         </w:rPr>
         <w:lastRenderedPageBreak/>
         <w:drawing>
-          <wp:inline distT="0" distB="0" distL="0" distR="0" wp14:anchorId="28A1CBDA" wp14:editId="62162D7B">
+          <wp:inline distT="0" distB="0" distL="0" distR="0" wp14:anchorId="17CCB639" wp14:editId="23776061">
             <wp:extent cx="5615940" cy="3182366"/>
             <wp:effectExtent l="0" t="0" r="0" b="0"/>
             <wp:docPr id="3" name="Picture 3" descr="图 3  离线判定由连续失败计数改为滑窗失败率"/>
@@ -6399,7 +6399,7 @@
         </w:rPr>
         <w:lastRenderedPageBreak/>
         <w:drawing>
-          <wp:inline distT="0" distB="0" distL="0" distR="0" wp14:anchorId="07DBA5DF" wp14:editId="10771BDB">
+          <wp:inline distT="0" distB="0" distL="0" distR="0" wp14:anchorId="35B94181" wp14:editId="1F12CAA8">
             <wp:extent cx="5615940" cy="3619162"/>
             <wp:effectExtent l="0" t="0" r="0" b="0"/>
             <wp:docPr id="4" name="Picture 4" descr="图 4  本地安全环与点表人工确认闸门"/>
@@ -6453,7 +6453,7 @@
       <w:pPr>
         <w:pStyle w:val="3"/>
       </w:pPr>
-      <w:bookmarkStart w:id="14" w:name="_Toc240384413"/>
+      <w:bookmarkStart w:id="14" w:name="_Toc240385763"/>
       <w:r>
         <w:t>总线探查与寄存器解码</w:t>
       </w:r>
@@ -6575,7 +6575,7 @@
         </w:rPr>
         <w:lastRenderedPageBreak/>
         <w:drawing>
-          <wp:inline distT="0" distB="0" distL="0" distR="0" wp14:anchorId="44744ABE" wp14:editId="3C643EFA">
+          <wp:inline distT="0" distB="0" distL="0" distR="0" wp14:anchorId="2EF54BE0" wp14:editId="136C96BC">
             <wp:extent cx="5615940" cy="2963968"/>
             <wp:effectExtent l="0" t="0" r="0" b="0"/>
             <wp:docPr id="5" name="Picture 5" descr="图 5  总线探查：从陌生总线到候选点表"/>
@@ -6753,7 +6753,7 @@
       <w:pPr>
         <w:pStyle w:val="3"/>
       </w:pPr>
-      <w:bookmarkStart w:id="15" w:name="_Toc240384414"/>
+      <w:bookmarkStart w:id="15" w:name="_Toc240385764"/>
       <w:r>
         <w:t>帧级质量统计与故障归因</w:t>
       </w:r>
@@ -6836,7 +6836,7 @@
       <w:pPr>
         <w:pStyle w:val="3"/>
       </w:pPr>
-      <w:bookmarkStart w:id="16" w:name="_Toc240384415"/>
+      <w:bookmarkStart w:id="16" w:name="_Toc240385765"/>
       <w:r>
         <w:t>掉电安全的配置提交</w:t>
       </w:r>
@@ -6882,7 +6882,7 @@
       <w:pPr>
         <w:pStyle w:val="3"/>
       </w:pPr>
-      <w:bookmarkStart w:id="17" w:name="_Toc240384416"/>
+      <w:bookmarkStart w:id="17" w:name="_Toc240385766"/>
       <w:r>
         <w:t xml:space="preserve">QSPI XIP </w:t>
       </w:r>
@@ -6995,7 +6995,7 @@
         </w:rPr>
         <w:lastRenderedPageBreak/>
         <w:drawing>
-          <wp:inline distT="0" distB="0" distL="0" distR="0" wp14:anchorId="6CD0E27F" wp14:editId="248E0EA3">
+          <wp:inline distT="0" distB="0" distL="0" distR="0" wp14:anchorId="47DF7347" wp14:editId="6256417C">
             <wp:extent cx="5615940" cy="3369564"/>
             <wp:effectExtent l="0" t="0" r="0" b="0"/>
             <wp:docPr id="6" name="Picture 6" descr="图 6  QSPI 原地执行约束下的启动链与升级路径"/>
@@ -7049,7 +7049,7 @@
       <w:pPr>
         <w:pStyle w:val="3"/>
       </w:pPr>
-      <w:bookmarkStart w:id="18" w:name="_Toc240384417"/>
+      <w:bookmarkStart w:id="18" w:name="_Toc240385767"/>
       <w:r>
         <w:t xml:space="preserve">openvela </w:t>
       </w:r>
@@ -7362,7 +7362,7 @@
       <w:pPr>
         <w:pStyle w:val="2"/>
       </w:pPr>
-      <w:bookmarkStart w:id="19" w:name="_Toc240384418"/>
+      <w:bookmarkStart w:id="19" w:name="_Toc240385768"/>
       <w:r>
         <w:t xml:space="preserve">3.4 </w:t>
       </w:r>
@@ -7375,7 +7375,7 @@
       <w:pPr>
         <w:pStyle w:val="3"/>
       </w:pPr>
-      <w:bookmarkStart w:id="20" w:name="_Toc240384419"/>
+      <w:bookmarkStart w:id="20" w:name="_Toc240385769"/>
       <w:r>
         <w:t>软件架构与启动</w:t>
       </w:r>
@@ -7804,7 +7804,7 @@
       <w:pPr>
         <w:pStyle w:val="3"/>
       </w:pPr>
-      <w:bookmarkStart w:id="21" w:name="_Toc240384420"/>
+      <w:bookmarkStart w:id="21" w:name="_Toc240385770"/>
       <w:r>
         <w:t>四条数据路径</w:t>
       </w:r>
@@ -7822,7 +7822,7 @@
           <w:noProof/>
         </w:rPr>
         <w:drawing>
-          <wp:inline distT="0" distB="0" distL="0" distR="0" wp14:anchorId="78D43749" wp14:editId="0059F4F1">
+          <wp:inline distT="0" distB="0" distL="0" distR="0" wp14:anchorId="221B11F5" wp14:editId="038CAAAA">
             <wp:extent cx="5615940" cy="4820348"/>
             <wp:effectExtent l="0" t="0" r="0" b="0"/>
             <wp:docPr id="7" name="Picture 7" descr="图 7  本地告警、联网解释、运行报告与云端留存的数据路径"/>
@@ -8176,7 +8176,7 @@
       <w:pPr>
         <w:pStyle w:val="3"/>
       </w:pPr>
-      <w:bookmarkStart w:id="22" w:name="_Toc240384421"/>
+      <w:bookmarkStart w:id="22" w:name="_Toc240385771"/>
       <w:r>
         <w:lastRenderedPageBreak/>
         <w:t>硬件设计与适配</w:t>
@@ -8689,7 +8689,7 @@
           <w:noProof/>
         </w:rPr>
         <w:drawing>
-          <wp:inline distT="0" distB="0" distL="0" distR="0" wp14:anchorId="16167A20" wp14:editId="7757D66B">
+          <wp:inline distT="0" distB="0" distL="0" distR="0" wp14:anchorId="467BFA3F" wp14:editId="1D3C2F76">
             <wp:extent cx="5615940" cy="2870369"/>
             <wp:effectExtent l="0" t="0" r="0" b="0"/>
             <wp:docPr id="8" name="Picture 8" descr="图 8  扩展板接口与接线"/>
@@ -9552,7 +9552,7 @@
       <w:pPr>
         <w:pStyle w:val="3"/>
       </w:pPr>
-      <w:bookmarkStart w:id="23" w:name="_Toc240384422"/>
+      <w:bookmarkStart w:id="23" w:name="_Toc240385772"/>
       <w:r>
         <w:t>交互与设备</w:t>
       </w:r>
@@ -9651,7 +9651,7 @@
         </w:rPr>
         <w:lastRenderedPageBreak/>
         <w:drawing>
-          <wp:inline distT="0" distB="0" distL="0" distR="0" wp14:anchorId="7FC9C94D" wp14:editId="7B3C79BE">
+          <wp:inline distT="0" distB="0" distL="0" distR="0" wp14:anchorId="28F57CEA" wp14:editId="6CC5D594">
             <wp:extent cx="5615940" cy="3182366"/>
             <wp:effectExtent l="0" t="0" r="0" b="0"/>
             <wp:docPr id="9" name="Picture 9" descr="图 9  告警页：三行活动告警与逐点静音、标记处理"/>
@@ -9713,7 +9713,7 @@
           <w:noProof/>
         </w:rPr>
         <w:drawing>
-          <wp:inline distT="0" distB="0" distL="0" distR="0" wp14:anchorId="5A176815" wp14:editId="4F00C36C">
+          <wp:inline distT="0" distB="0" distL="0" distR="0" wp14:anchorId="7C9F6DEC" wp14:editId="0B48EAF4">
             <wp:extent cx="5615940" cy="3182366"/>
             <wp:effectExtent l="0" t="0" r="0" b="0"/>
             <wp:docPr id="10" name="Picture 10" descr="图 10  趋势页：阈值线与历史窗口切换"/>
@@ -10147,7 +10147,7 @@
       <w:pPr>
         <w:pStyle w:val="3"/>
       </w:pPr>
-      <w:bookmarkStart w:id="24" w:name="_Toc240384423"/>
+      <w:bookmarkStart w:id="24" w:name="_Toc240385773"/>
       <w:r>
         <w:t>配套项目：上位机与云看板</w:t>
       </w:r>
@@ -10256,7 +10256,7 @@
         </w:rPr>
         <w:lastRenderedPageBreak/>
         <w:drawing>
-          <wp:inline distT="0" distB="0" distL="0" distR="0" wp14:anchorId="6B55DF3F" wp14:editId="58626BFF">
+          <wp:inline distT="0" distB="0" distL="0" distR="0" wp14:anchorId="076A3BA1" wp14:editId="117E50AE">
             <wp:extent cx="5615940" cy="3509963"/>
             <wp:effectExtent l="0" t="0" r="0" b="0"/>
             <wp:docPr id="11" name="Picture 11" descr="图 11  点表配置上位机：编辑、试读与人工确认；点表卡片取自示例文件"/>
@@ -10430,7 +10430,7 @@
       <w:pPr>
         <w:pStyle w:val="3"/>
       </w:pPr>
-      <w:bookmarkStart w:id="25" w:name="_Toc240384424"/>
+      <w:bookmarkStart w:id="25" w:name="_Toc240385774"/>
       <w:r>
         <w:t>复现入口</w:t>
       </w:r>
@@ -10582,7 +10582,7 @@
         <w:pStyle w:val="2"/>
         <w:pageBreakBefore/>
       </w:pPr>
-      <w:bookmarkStart w:id="26" w:name="_Toc240384425"/>
+      <w:bookmarkStart w:id="26" w:name="_Toc240385775"/>
       <w:r>
         <w:lastRenderedPageBreak/>
         <w:t xml:space="preserve">3.5 </w:t>
@@ -10596,7 +10596,7 @@
       <w:pPr>
         <w:pStyle w:val="3"/>
       </w:pPr>
-      <w:bookmarkStart w:id="27" w:name="_Toc240384426"/>
+      <w:bookmarkStart w:id="27" w:name="_Toc240385776"/>
       <w:r>
         <w:t>测试环境与证据范围</w:t>
       </w:r>
@@ -11650,7 +11650,7 @@
       <w:pPr>
         <w:pStyle w:val="3"/>
       </w:pPr>
-      <w:bookmarkStart w:id="28" w:name="_Toc240384427"/>
+      <w:bookmarkStart w:id="28" w:name="_Toc240385777"/>
       <w:r>
         <w:t>带屏静止首页性能</w:t>
       </w:r>
@@ -12255,7 +12255,7 @@
       <w:pPr>
         <w:pStyle w:val="3"/>
       </w:pPr>
-      <w:bookmarkStart w:id="29" w:name="_Toc240384428"/>
+      <w:bookmarkStart w:id="29" w:name="_Toc240385778"/>
       <w:r>
         <w:t xml:space="preserve">openvelaClaw </w:t>
       </w:r>
@@ -12790,7 +12790,7 @@
       <w:pPr>
         <w:pStyle w:val="3"/>
       </w:pPr>
-      <w:bookmarkStart w:id="30" w:name="_Toc240384429"/>
+      <w:bookmarkStart w:id="30" w:name="_Toc240385779"/>
       <w:r>
         <w:t>可靠性与稳定性</w:t>
       </w:r>
@@ -12869,7 +12869,7 @@
       <w:pPr>
         <w:pStyle w:val="2"/>
       </w:pPr>
-      <w:bookmarkStart w:id="31" w:name="_Toc240384430"/>
+      <w:bookmarkStart w:id="31" w:name="_Toc240385780"/>
       <w:r>
         <w:t xml:space="preserve">3.6 AI-Native </w:t>
       </w:r>
@@ -13475,7 +13475,7 @@
       <w:pPr>
         <w:pStyle w:val="3"/>
       </w:pPr>
-      <w:bookmarkStart w:id="32" w:name="_Toc240384431"/>
+      <w:bookmarkStart w:id="32" w:name="_Toc240385781"/>
       <w:r>
         <w:t>开发方式与经验</w:t>
       </w:r>
@@ -13571,7 +13571,7 @@
       <w:pPr>
         <w:pStyle w:val="2"/>
       </w:pPr>
-      <w:bookmarkStart w:id="33" w:name="_Toc240384432"/>
+      <w:bookmarkStart w:id="33" w:name="_Toc240385782"/>
       <w:r>
         <w:t xml:space="preserve">3.7 </w:t>
       </w:r>
@@ -13584,7 +13584,7 @@
       <w:pPr>
         <w:pStyle w:val="3"/>
       </w:pPr>
-      <w:bookmarkStart w:id="34" w:name="_Toc240384433"/>
+      <w:bookmarkStart w:id="34" w:name="_Toc240385783"/>
       <w:r>
         <w:t>成果总结</w:t>
       </w:r>
@@ -13710,7 +13710,7 @@
       <w:pPr>
         <w:pStyle w:val="3"/>
       </w:pPr>
-      <w:bookmarkStart w:id="35" w:name="_Toc240384434"/>
+      <w:bookmarkStart w:id="35" w:name="_Toc240385784"/>
       <w:r>
         <w:t>应用前景与商业价值</w:t>
       </w:r>
@@ -13761,7 +13761,7 @@
       <w:pPr>
         <w:pStyle w:val="3"/>
       </w:pPr>
-      <w:bookmarkStart w:id="36" w:name="_Toc240384435"/>
+      <w:bookmarkStart w:id="36" w:name="_Toc240385785"/>
       <w:r>
         <w:lastRenderedPageBreak/>
         <w:t>不足与后续重点</w:t>
@@ -14058,7 +14058,7 @@
       <w:pPr>
         <w:pStyle w:val="3"/>
       </w:pPr>
-      <w:bookmarkStart w:id="37" w:name="_Toc240384436"/>
+      <w:bookmarkStart w:id="37" w:name="_Toc240385786"/>
       <w:r>
         <w:t>实现与证据索引</w:t>
       </w:r>
@@ -15259,9 +15259,9 @@
 <file path=word/numbering.xml><?xml version="1.0" encoding="utf-8"?>
 <w:numbering xmlns:wpc="http://schemas.microsoft.com/office/word/2010/wordprocessingCanvas" xmlns:cx="http://schemas.microsoft.com/office/drawing/2014/chartex" xmlns:cx1="http://schemas.microsoft.com/office/drawing/2015/9/8/chartex" xmlns:cx2="http://schemas.microsoft.com/office/drawing/2015/10/21/chartex" xmlns:cx3="http://schemas.microsoft.com/office/drawing/2016/5/9/chartex" xmlns:cx4="http://schemas.microsoft.com/office/drawing/2016/5/10/chartex" xmlns:cx5="http://schemas.microsoft.com/office/drawing/2016/5/11/chartex" xmlns:cx6="http://schemas.microsoft.com/office/drawing/2016/5/12/chartex" xmlns:cx7="http://schemas.microsoft.com/office/drawing/2016/5/13/chartex" xmlns:cx8="http://schemas.microsoft.com/office/drawing/2016/5/14/chartex" xmlns:mc="http://schemas.openxmlformats.org/markup-compatibility/2006" xmlns:aink="http://schemas.microsoft.com/office/drawing/2016/ink" xmlns:am3d="http://schemas.microsoft.com/office/drawing/2017/model3d" xmlns:o="urn:schemas-microsoft-com:office:office" xmlns:oel="http://schemas.microsoft.com/office/2019/extlst" xmlns:r="http://schemas.openxmlformats.org/officeDocument/2006/relationships" xmlns:m="http://schemas.openxmlformats.org/officeDocument/2006/math" xmlns:v="urn:schemas-microsoft-com:vml" xmlns:wp14="http://schemas.microsoft.com/office/word/2010/wordprocessingDrawing" xmlns:wp="http://schemas.openxmlformats.org/drawingml/2006/wordprocessingDrawing" xmlns:w10="urn:schemas-microsoft-com:office:word" xmlns:w="http://schemas.openxmlformats.org/wordprocessingml/2006/main" xmlns:w14="http://schemas.microsoft.com/office/word/2010/wordml" xmlns:w15="http://schemas.microsoft.com/office/word/2012/wordml" xmlns:w16cex="http://schemas.microsoft.com/office/word/2018/wordml/cex" xmlns:w16cid="http://schemas.microsoft.com/office/word/2016/wordml/cid" xmlns:w16="http://schemas.microsoft.com/office/word/2018/wordml" xmlns:w16du="http://schemas.microsoft.com/office/word/2023/wordml/word16du" xmlns:w16sdtdh="http://schemas.microsoft.com/office/word/2020/wordml/sdtdatahash" xmlns:w16sdtfl="http://schemas.microsoft.com/office/word/2024/wordml/sdtformatlock" xmlns:w16se="http://schemas.microsoft.com/office/word/2015/wordml/symex" xmlns:wpg="http://schemas.microsoft.com/office/word/2010/wordprocessingGroup" xmlns:wpi="http://schemas.microsoft.com/office/word/2010/wordprocessingInk" xmlns:wne="http://schemas.microsoft.com/office/word/2006/wordml" xmlns:wps="http://schemas.microsoft.com/office/word/2010/wordprocessingShape" mc:Ignorable="w14 w15 w16se w16cid w16 w16cex w16sdtdh w16sdtfl w16du wp14">
   <w:abstractNum w:abstractNumId="0" w15:restartNumberingAfterBreak="0">
-    <w:nsid w:val="03493E9A"/>
+    <w:nsid w:val="02F21D81"/>
     <w:multiLevelType w:val="multilevel"/>
-    <w:tmpl w:val="BD5CE1AC"/>
+    <w:tmpl w:val="1A405060"/>
     <w:lvl w:ilvl="0">
       <w:numFmt w:val="bullet"/>
       <w:lvlText w:val="•"/>
@@ -15312,9 +15312,9 @@
     </w:lvl>
   </w:abstractNum>
   <w:abstractNum w:abstractNumId="1" w15:restartNumberingAfterBreak="0">
-    <w:nsid w:val="13142638"/>
+    <w:nsid w:val="0371290A"/>
     <w:multiLevelType w:val="multilevel"/>
-    <w:tmpl w:val="B5A4F688"/>
+    <w:tmpl w:val="347837E4"/>
     <w:lvl w:ilvl="0">
       <w:numFmt w:val="bullet"/>
       <w:lvlText w:val="•"/>
@@ -15365,9 +15365,9 @@
     </w:lvl>
   </w:abstractNum>
   <w:abstractNum w:abstractNumId="2" w15:restartNumberingAfterBreak="0">
-    <w:nsid w:val="14C45AEF"/>
+    <w:nsid w:val="09C454BC"/>
     <w:multiLevelType w:val="multilevel"/>
-    <w:tmpl w:val="8EDAD618"/>
+    <w:tmpl w:val="0B5C4A7C"/>
     <w:lvl w:ilvl="0">
       <w:numFmt w:val="bullet"/>
       <w:lvlText w:val="•"/>
@@ -15418,9 +15418,9 @@
     </w:lvl>
   </w:abstractNum>
   <w:abstractNum w:abstractNumId="3" w15:restartNumberingAfterBreak="0">
-    <w:nsid w:val="16B01E8B"/>
+    <w:nsid w:val="0BAC672C"/>
     <w:multiLevelType w:val="multilevel"/>
-    <w:tmpl w:val="07DCD092"/>
+    <w:tmpl w:val="ACEC6E6E"/>
     <w:lvl w:ilvl="0">
       <w:numFmt w:val="bullet"/>
       <w:lvlText w:val="•"/>
@@ -15471,9 +15471,9 @@
     </w:lvl>
   </w:abstractNum>
   <w:abstractNum w:abstractNumId="4" w15:restartNumberingAfterBreak="0">
-    <w:nsid w:val="1EBA74C5"/>
+    <w:nsid w:val="0DB57C6D"/>
     <w:multiLevelType w:val="multilevel"/>
-    <w:tmpl w:val="04E29384"/>
+    <w:tmpl w:val="59B62B26"/>
     <w:lvl w:ilvl="0">
       <w:numFmt w:val="bullet"/>
       <w:lvlText w:val="•"/>
@@ -15524,9 +15524,9 @@
     </w:lvl>
   </w:abstractNum>
   <w:abstractNum w:abstractNumId="5" w15:restartNumberingAfterBreak="0">
-    <w:nsid w:val="2DFD7E64"/>
+    <w:nsid w:val="160E3FE3"/>
     <w:multiLevelType w:val="multilevel"/>
-    <w:tmpl w:val="068A2132"/>
+    <w:tmpl w:val="5E649990"/>
     <w:lvl w:ilvl="0">
       <w:numFmt w:val="bullet"/>
       <w:lvlText w:val="•"/>
@@ -15577,9 +15577,9 @@
     </w:lvl>
   </w:abstractNum>
   <w:abstractNum w:abstractNumId="6" w15:restartNumberingAfterBreak="0">
-    <w:nsid w:val="3070014B"/>
+    <w:nsid w:val="163F111F"/>
     <w:multiLevelType w:val="multilevel"/>
-    <w:tmpl w:val="B464D186"/>
+    <w:tmpl w:val="26969580"/>
     <w:lvl w:ilvl="0">
       <w:numFmt w:val="bullet"/>
       <w:lvlText w:val="•"/>
@@ -15630,9 +15630,9 @@
     </w:lvl>
   </w:abstractNum>
   <w:abstractNum w:abstractNumId="7" w15:restartNumberingAfterBreak="0">
-    <w:nsid w:val="31AA73DE"/>
+    <w:nsid w:val="17F254C9"/>
     <w:multiLevelType w:val="multilevel"/>
-    <w:tmpl w:val="CB225AC8"/>
+    <w:tmpl w:val="C80C2E84"/>
     <w:lvl w:ilvl="0">
       <w:numFmt w:val="bullet"/>
       <w:lvlText w:val="•"/>
@@ -15683,9 +15683,9 @@
     </w:lvl>
   </w:abstractNum>
   <w:abstractNum w:abstractNumId="8" w15:restartNumberingAfterBreak="0">
-    <w:nsid w:val="35E01999"/>
+    <w:nsid w:val="1D1B55B4"/>
     <w:multiLevelType w:val="multilevel"/>
-    <w:tmpl w:val="70FA8AEA"/>
+    <w:tmpl w:val="63368E9E"/>
     <w:lvl w:ilvl="0">
       <w:numFmt w:val="bullet"/>
       <w:lvlText w:val="•"/>
@@ -15736,9 +15736,9 @@
     </w:lvl>
   </w:abstractNum>
   <w:abstractNum w:abstractNumId="9" w15:restartNumberingAfterBreak="0">
-    <w:nsid w:val="3E5911A2"/>
+    <w:nsid w:val="21863FDC"/>
     <w:multiLevelType w:val="multilevel"/>
-    <w:tmpl w:val="2EE0A6EC"/>
+    <w:tmpl w:val="4ACAB61A"/>
     <w:lvl w:ilvl="0">
       <w:numFmt w:val="bullet"/>
       <w:lvlText w:val="•"/>
@@ -15789,9 +15789,9 @@
     </w:lvl>
   </w:abstractNum>
   <w:abstractNum w:abstractNumId="10" w15:restartNumberingAfterBreak="0">
-    <w:nsid w:val="48A76AFD"/>
+    <w:nsid w:val="26385CBA"/>
     <w:multiLevelType w:val="multilevel"/>
-    <w:tmpl w:val="5AD87316"/>
+    <w:tmpl w:val="2034B17A"/>
     <w:lvl w:ilvl="0">
       <w:numFmt w:val="bullet"/>
       <w:lvlText w:val="•"/>
@@ -15842,9 +15842,9 @@
     </w:lvl>
   </w:abstractNum>
   <w:abstractNum w:abstractNumId="11" w15:restartNumberingAfterBreak="0">
-    <w:nsid w:val="4FE5385D"/>
+    <w:nsid w:val="29A14010"/>
     <w:multiLevelType w:val="multilevel"/>
-    <w:tmpl w:val="339C6B8C"/>
+    <w:tmpl w:val="D2580A52"/>
     <w:lvl w:ilvl="0">
       <w:numFmt w:val="bullet"/>
       <w:lvlText w:val="•"/>
@@ -15895,9 +15895,9 @@
     </w:lvl>
   </w:abstractNum>
   <w:abstractNum w:abstractNumId="12" w15:restartNumberingAfterBreak="0">
-    <w:nsid w:val="590C65B7"/>
+    <w:nsid w:val="31D85F8B"/>
     <w:multiLevelType w:val="multilevel"/>
-    <w:tmpl w:val="D3BEB398"/>
+    <w:tmpl w:val="39B4132C"/>
     <w:lvl w:ilvl="0">
       <w:numFmt w:val="bullet"/>
       <w:lvlText w:val="•"/>
@@ -15948,9 +15948,9 @@
     </w:lvl>
   </w:abstractNum>
   <w:abstractNum w:abstractNumId="13" w15:restartNumberingAfterBreak="0">
-    <w:nsid w:val="5C493319"/>
+    <w:nsid w:val="32EC5767"/>
     <w:multiLevelType w:val="multilevel"/>
-    <w:tmpl w:val="0D44580A"/>
+    <w:tmpl w:val="80B088DC"/>
     <w:lvl w:ilvl="0">
       <w:numFmt w:val="bullet"/>
       <w:lvlText w:val="•"/>
@@ -16001,9 +16001,9 @@
     </w:lvl>
   </w:abstractNum>
   <w:abstractNum w:abstractNumId="14" w15:restartNumberingAfterBreak="0">
-    <w:nsid w:val="5C544E99"/>
+    <w:nsid w:val="33B847E8"/>
     <w:multiLevelType w:val="multilevel"/>
-    <w:tmpl w:val="25AA5FDA"/>
+    <w:tmpl w:val="B0CAD4AC"/>
     <w:lvl w:ilvl="0">
       <w:numFmt w:val="bullet"/>
       <w:lvlText w:val="•"/>
@@ -16054,9 +16054,9 @@
     </w:lvl>
   </w:abstractNum>
   <w:abstractNum w:abstractNumId="15" w15:restartNumberingAfterBreak="0">
-    <w:nsid w:val="5C58629D"/>
+    <w:nsid w:val="3A156DC8"/>
     <w:multiLevelType w:val="multilevel"/>
-    <w:tmpl w:val="C3C6F6BC"/>
+    <w:tmpl w:val="D4C04D2A"/>
     <w:lvl w:ilvl="0">
       <w:numFmt w:val="bullet"/>
       <w:lvlText w:val="•"/>
@@ -16107,9 +16107,9 @@
     </w:lvl>
   </w:abstractNum>
   <w:abstractNum w:abstractNumId="16" w15:restartNumberingAfterBreak="0">
-    <w:nsid w:val="5C77788D"/>
+    <w:nsid w:val="3DDE391F"/>
     <w:multiLevelType w:val="multilevel"/>
-    <w:tmpl w:val="272C4E54"/>
+    <w:tmpl w:val="2E92F522"/>
     <w:lvl w:ilvl="0">
       <w:numFmt w:val="bullet"/>
       <w:lvlText w:val="•"/>
@@ -16160,9 +16160,9 @@
     </w:lvl>
   </w:abstractNum>
   <w:abstractNum w:abstractNumId="17" w15:restartNumberingAfterBreak="0">
-    <w:nsid w:val="5DE13C49"/>
+    <w:nsid w:val="3F835345"/>
     <w:multiLevelType w:val="multilevel"/>
-    <w:tmpl w:val="D8F4A79E"/>
+    <w:tmpl w:val="93AA68A2"/>
     <w:lvl w:ilvl="0">
       <w:numFmt w:val="bullet"/>
       <w:lvlText w:val="•"/>
@@ -16213,9 +16213,9 @@
     </w:lvl>
   </w:abstractNum>
   <w:abstractNum w:abstractNumId="18" w15:restartNumberingAfterBreak="0">
-    <w:nsid w:val="61E975AF"/>
+    <w:nsid w:val="45E52036"/>
     <w:multiLevelType w:val="multilevel"/>
-    <w:tmpl w:val="F9386AE4"/>
+    <w:tmpl w:val="D974F010"/>
     <w:lvl w:ilvl="0">
       <w:numFmt w:val="bullet"/>
       <w:lvlText w:val="•"/>
@@ -16266,9 +16266,9 @@
     </w:lvl>
   </w:abstractNum>
   <w:abstractNum w:abstractNumId="19" w15:restartNumberingAfterBreak="0">
-    <w:nsid w:val="6499131B"/>
+    <w:nsid w:val="52054FC0"/>
     <w:multiLevelType w:val="multilevel"/>
-    <w:tmpl w:val="2D1E1EA0"/>
+    <w:tmpl w:val="86E2F198"/>
     <w:lvl w:ilvl="0">
       <w:numFmt w:val="bullet"/>
       <w:lvlText w:val="•"/>
@@ -16319,9 +16319,9 @@
     </w:lvl>
   </w:abstractNum>
   <w:abstractNum w:abstractNumId="20" w15:restartNumberingAfterBreak="0">
-    <w:nsid w:val="66AA4BAD"/>
+    <w:nsid w:val="53FD66B2"/>
     <w:multiLevelType w:val="multilevel"/>
-    <w:tmpl w:val="02F8494C"/>
+    <w:tmpl w:val="111CA936"/>
     <w:lvl w:ilvl="0">
       <w:numFmt w:val="bullet"/>
       <w:lvlText w:val="•"/>
@@ -16372,9 +16372,9 @@
     </w:lvl>
   </w:abstractNum>
   <w:abstractNum w:abstractNumId="21" w15:restartNumberingAfterBreak="0">
-    <w:nsid w:val="68DE5828"/>
+    <w:nsid w:val="571462AF"/>
     <w:multiLevelType w:val="multilevel"/>
-    <w:tmpl w:val="8228C53E"/>
+    <w:tmpl w:val="5B58BD4E"/>
     <w:lvl w:ilvl="0">
       <w:numFmt w:val="bullet"/>
       <w:lvlText w:val="•"/>
@@ -16425,9 +16425,9 @@
     </w:lvl>
   </w:abstractNum>
   <w:abstractNum w:abstractNumId="22" w15:restartNumberingAfterBreak="0">
-    <w:nsid w:val="6BA14678"/>
+    <w:nsid w:val="5D205ECF"/>
     <w:multiLevelType w:val="multilevel"/>
-    <w:tmpl w:val="7FBE3DEA"/>
+    <w:tmpl w:val="D12AAE50"/>
     <w:lvl w:ilvl="0">
       <w:numFmt w:val="bullet"/>
       <w:lvlText w:val="•"/>
@@ -16478,9 +16478,9 @@
     </w:lvl>
   </w:abstractNum>
   <w:abstractNum w:abstractNumId="23" w15:restartNumberingAfterBreak="0">
-    <w:nsid w:val="6DA47203"/>
+    <w:nsid w:val="5EF410C5"/>
     <w:multiLevelType w:val="multilevel"/>
-    <w:tmpl w:val="73D4E6E4"/>
+    <w:tmpl w:val="FCA61562"/>
     <w:lvl w:ilvl="0">
       <w:numFmt w:val="bullet"/>
       <w:lvlText w:val="•"/>
@@ -16531,9 +16531,9 @@
     </w:lvl>
   </w:abstractNum>
   <w:abstractNum w:abstractNumId="24" w15:restartNumberingAfterBreak="0">
-    <w:nsid w:val="6F3A63CC"/>
+    <w:nsid w:val="63E04D29"/>
     <w:multiLevelType w:val="multilevel"/>
-    <w:tmpl w:val="A342CB56"/>
+    <w:tmpl w:val="DCB24F5A"/>
     <w:lvl w:ilvl="0">
       <w:numFmt w:val="bullet"/>
       <w:lvlText w:val="•"/>
@@ -16584,9 +16584,9 @@
     </w:lvl>
   </w:abstractNum>
   <w:abstractNum w:abstractNumId="25" w15:restartNumberingAfterBreak="0">
-    <w:nsid w:val="75C8387B"/>
+    <w:nsid w:val="66895135"/>
     <w:multiLevelType w:val="multilevel"/>
-    <w:tmpl w:val="2716E822"/>
+    <w:tmpl w:val="493A8DB4"/>
     <w:lvl w:ilvl="0">
       <w:numFmt w:val="bullet"/>
       <w:lvlText w:val="•"/>
@@ -16637,9 +16637,9 @@
     </w:lvl>
   </w:abstractNum>
   <w:abstractNum w:abstractNumId="26" w15:restartNumberingAfterBreak="0">
-    <w:nsid w:val="7AF84EA5"/>
+    <w:nsid w:val="6E5F0862"/>
     <w:multiLevelType w:val="multilevel"/>
-    <w:tmpl w:val="331ADE64"/>
+    <w:tmpl w:val="6D5A906C"/>
     <w:lvl w:ilvl="0">
       <w:numFmt w:val="bullet"/>
       <w:lvlText w:val="•"/>
@@ -16690,9 +16690,9 @@
     </w:lvl>
   </w:abstractNum>
   <w:abstractNum w:abstractNumId="27" w15:restartNumberingAfterBreak="0">
-    <w:nsid w:val="7B0D6CFB"/>
+    <w:nsid w:val="72C6558E"/>
     <w:multiLevelType w:val="multilevel"/>
-    <w:tmpl w:val="6DF60A9E"/>
+    <w:tmpl w:val="BBFC436A"/>
     <w:lvl w:ilvl="0">
       <w:numFmt w:val="bullet"/>
       <w:lvlText w:val="•"/>
@@ -16743,9 +16743,9 @@
     </w:lvl>
   </w:abstractNum>
   <w:abstractNum w:abstractNumId="28" w15:restartNumberingAfterBreak="0">
-    <w:nsid w:val="7FB7612B"/>
+    <w:nsid w:val="7E4B50B8"/>
     <w:multiLevelType w:val="multilevel"/>
-    <w:tmpl w:val="F93C0E82"/>
+    <w:tmpl w:val="C59A1B32"/>
     <w:lvl w:ilvl="0">
       <w:numFmt w:val="bullet"/>
       <w:lvlText w:val="•"/>
@@ -16795,92 +16795,92 @@
       <w:lvlJc w:val="left"/>
     </w:lvl>
   </w:abstractNum>
-  <w:num w:numId="1" w16cid:durableId="53045755">
+  <w:num w:numId="1" w16cid:durableId="1339505794">
+    <w:abstractNumId w:val="11"/>
+  </w:num>
+  <w:num w:numId="2" w16cid:durableId="777142952">
+    <w:abstractNumId w:val="21"/>
+  </w:num>
+  <w:num w:numId="3" w16cid:durableId="434911928">
+    <w:abstractNumId w:val="0"/>
+  </w:num>
+  <w:num w:numId="4" w16cid:durableId="1469393365">
+    <w:abstractNumId w:val="4"/>
+  </w:num>
+  <w:num w:numId="5" w16cid:durableId="1680353000">
+    <w:abstractNumId w:val="10"/>
+  </w:num>
+  <w:num w:numId="6" w16cid:durableId="1063069453">
+    <w:abstractNumId w:val="2"/>
+  </w:num>
+  <w:num w:numId="7" w16cid:durableId="341014377">
+    <w:abstractNumId w:val="8"/>
+  </w:num>
+  <w:num w:numId="8" w16cid:durableId="1806463938">
+    <w:abstractNumId w:val="19"/>
+  </w:num>
+  <w:num w:numId="9" w16cid:durableId="1252086698">
+    <w:abstractNumId w:val="15"/>
+  </w:num>
+  <w:num w:numId="10" w16cid:durableId="1382822394">
+    <w:abstractNumId w:val="1"/>
+  </w:num>
+  <w:num w:numId="11" w16cid:durableId="831945537">
+    <w:abstractNumId w:val="6"/>
+  </w:num>
+  <w:num w:numId="12" w16cid:durableId="1249654582">
+    <w:abstractNumId w:val="25"/>
+  </w:num>
+  <w:num w:numId="13" w16cid:durableId="1133909405">
+    <w:abstractNumId w:val="27"/>
+  </w:num>
+  <w:num w:numId="14" w16cid:durableId="1968194804">
+    <w:abstractNumId w:val="23"/>
+  </w:num>
+  <w:num w:numId="15" w16cid:durableId="1060595147">
+    <w:abstractNumId w:val="16"/>
+  </w:num>
+  <w:num w:numId="16" w16cid:durableId="1380856692">
+    <w:abstractNumId w:val="24"/>
+  </w:num>
+  <w:num w:numId="17" w16cid:durableId="204954820">
+    <w:abstractNumId w:val="3"/>
+  </w:num>
+  <w:num w:numId="18" w16cid:durableId="119765691">
+    <w:abstractNumId w:val="7"/>
+  </w:num>
+  <w:num w:numId="19" w16cid:durableId="2111927150">
+    <w:abstractNumId w:val="28"/>
+  </w:num>
+  <w:num w:numId="20" w16cid:durableId="977223984">
+    <w:abstractNumId w:val="13"/>
+  </w:num>
+  <w:num w:numId="21" w16cid:durableId="844587287">
+    <w:abstractNumId w:val="5"/>
+  </w:num>
+  <w:num w:numId="22" w16cid:durableId="1872526251">
+    <w:abstractNumId w:val="14"/>
+  </w:num>
+  <w:num w:numId="23" w16cid:durableId="782965660">
     <w:abstractNumId w:val="26"/>
   </w:num>
-  <w:num w:numId="2" w16cid:durableId="582956977">
-    <w:abstractNumId w:val="0"/>
+  <w:num w:numId="24" w16cid:durableId="474182875">
+    <w:abstractNumId w:val="20"/>
   </w:num>
-  <w:num w:numId="3" w16cid:durableId="338316773">
-    <w:abstractNumId w:val="28"/>
+  <w:num w:numId="25" w16cid:durableId="654452049">
+    <w:abstractNumId w:val="12"/>
   </w:num>
-  <w:num w:numId="4" w16cid:durableId="848833903">
-    <w:abstractNumId w:val="23"/>
+  <w:num w:numId="26" w16cid:durableId="1953510386">
+    <w:abstractNumId w:val="22"/>
   </w:num>
-  <w:num w:numId="5" w16cid:durableId="918634547">
-    <w:abstractNumId w:val="11"/>
-  </w:num>
-  <w:num w:numId="6" w16cid:durableId="1095051562">
-    <w:abstractNumId w:val="4"/>
-  </w:num>
-  <w:num w:numId="7" w16cid:durableId="2074355702">
-    <w:abstractNumId w:val="5"/>
-  </w:num>
-  <w:num w:numId="8" w16cid:durableId="53048746">
-    <w:abstractNumId w:val="27"/>
-  </w:num>
-  <w:num w:numId="9" w16cid:durableId="1728650983">
-    <w:abstractNumId w:val="19"/>
-  </w:num>
-  <w:num w:numId="10" w16cid:durableId="1937328296">
-    <w:abstractNumId w:val="13"/>
-  </w:num>
-  <w:num w:numId="11" w16cid:durableId="463742965">
-    <w:abstractNumId w:val="1"/>
-  </w:num>
-  <w:num w:numId="12" w16cid:durableId="276642434">
+  <w:num w:numId="27" w16cid:durableId="1312825899">
     <w:abstractNumId w:val="9"/>
   </w:num>
-  <w:num w:numId="13" w16cid:durableId="341124441">
-    <w:abstractNumId w:val="14"/>
-  </w:num>
-  <w:num w:numId="14" w16cid:durableId="2046177370">
-    <w:abstractNumId w:val="12"/>
-  </w:num>
-  <w:num w:numId="15" w16cid:durableId="641276118">
-    <w:abstractNumId w:val="24"/>
-  </w:num>
-  <w:num w:numId="16" w16cid:durableId="76633130">
-    <w:abstractNumId w:val="6"/>
-  </w:num>
-  <w:num w:numId="17" w16cid:durableId="1405224420">
-    <w:abstractNumId w:val="10"/>
-  </w:num>
-  <w:num w:numId="18" w16cid:durableId="912929769">
-    <w:abstractNumId w:val="15"/>
-  </w:num>
-  <w:num w:numId="19" w16cid:durableId="335183583">
+  <w:num w:numId="28" w16cid:durableId="799035958">
     <w:abstractNumId w:val="17"/>
   </w:num>
-  <w:num w:numId="20" w16cid:durableId="822157010">
+  <w:num w:numId="29" w16cid:durableId="992681384">
     <w:abstractNumId w:val="18"/>
-  </w:num>
-  <w:num w:numId="21" w16cid:durableId="2137599218">
-    <w:abstractNumId w:val="16"/>
-  </w:num>
-  <w:num w:numId="22" w16cid:durableId="1863931654">
-    <w:abstractNumId w:val="7"/>
-  </w:num>
-  <w:num w:numId="23" w16cid:durableId="856429567">
-    <w:abstractNumId w:val="3"/>
-  </w:num>
-  <w:num w:numId="24" w16cid:durableId="1036537737">
-    <w:abstractNumId w:val="2"/>
-  </w:num>
-  <w:num w:numId="25" w16cid:durableId="770781148">
-    <w:abstractNumId w:val="20"/>
-  </w:num>
-  <w:num w:numId="26" w16cid:durableId="1097209247">
-    <w:abstractNumId w:val="25"/>
-  </w:num>
-  <w:num w:numId="27" w16cid:durableId="622077175">
-    <w:abstractNumId w:val="8"/>
-  </w:num>
-  <w:num w:numId="28" w16cid:durableId="1999577149">
-    <w:abstractNumId w:val="22"/>
-  </w:num>
-  <w:num w:numId="29" w16cid:durableId="1905018496">
-    <w:abstractNumId w:val="21"/>
   </w:num>
 </w:numbering>
 </file>
@@ -17500,7 +17500,7 @@
       <w:tabs>
         <w:tab w:val="right" w:leader="dot" w:pos="8784"/>
       </w:tabs>
-      <w:spacing w:line="330" w:lineRule="exact"/>
+      <w:spacing w:line="300" w:lineRule="exact"/>
       <w:ind w:firstLine="0"/>
       <w:jc w:val="left"/>
     </w:pPr>
@@ -17519,7 +17519,7 @@
       <w:tabs>
         <w:tab w:val="right" w:leader="dot" w:pos="8784"/>
       </w:tabs>
-      <w:spacing w:line="285" w:lineRule="exact"/>
+      <w:spacing w:line="262" w:lineRule="exact"/>
       <w:ind w:left="360" w:firstLine="0"/>
       <w:jc w:val="left"/>
     </w:pPr>
@@ -17538,7 +17538,7 @@
       <w:tabs>
         <w:tab w:val="right" w:leader="dot" w:pos="8784"/>
       </w:tabs>
-      <w:spacing w:line="260" w:lineRule="exact"/>
+      <w:spacing w:line="240" w:lineRule="exact"/>
       <w:ind w:left="720" w:firstLine="0"/>
       <w:jc w:val="left"/>
     </w:pPr>
@@ -17552,7 +17552,7 @@
     <w:basedOn w:val="a0"/>
     <w:uiPriority w:val="99"/>
     <w:unhideWhenUsed/>
-    <w:rsid w:val="00D124DC"/>
+    <w:rsid w:val="00940A76"/>
     <w:rPr>
       <w:color w:val="467886" w:themeColor="hyperlink"/>
       <w:u w:val="single"/>

</xml_diff>

<commit_message>
docs(submission): add PDF navigation bookmarks to the tech report
Word's ExportAsFixedFormat was called without CreateBookmarks, so the
exported PDF had no outline. Rebuild with a pypdf post-step that locates
each heading by text and writes the outline tree (目录/1、信息表/2、摘要/
3、正文 with 3.1-3.7 and the evidence index nested underneath).
</commit_message>
<xml_diff>
--- a/docs/submission/VelaGuard-技术报告.docx
+++ b/docs/submission/VelaGuard-技术报告.docx
@@ -58,7 +58,7 @@
       <w:r>
         <w:fldChar w:fldCharType="separate"/>
       </w:r>
-      <w:hyperlink w:anchor="_Toc240812483" w:history="1">
+      <w:hyperlink w:anchor="_Toc240816110" w:history="1">
         <w:r>
           <w:rPr>
             <w:rStyle w:val="a5"/>
@@ -102,7 +102,7 @@
             <w:noProof/>
             <w:webHidden/>
           </w:rPr>
-          <w:instrText>PAGEREF _Toc240812483 \h</w:instrText>
+          <w:instrText>PAGEREF _Toc240816110 \h</w:instrText>
         </w:r>
         <w:r>
           <w:rPr>
@@ -155,7 +155,7 @@
           <w14:ligatures w14:val="standardContextual"/>
         </w:rPr>
       </w:pPr>
-      <w:hyperlink w:anchor="_Toc240812484" w:history="1">
+      <w:hyperlink w:anchor="_Toc240816111" w:history="1">
         <w:r>
           <w:rPr>
             <w:rStyle w:val="a5"/>
@@ -199,7 +199,7 @@
             <w:noProof/>
             <w:webHidden/>
           </w:rPr>
-          <w:instrText>PAGEREF _Toc240812484 \h</w:instrText>
+          <w:instrText>PAGEREF _Toc240816111 \h</w:instrText>
         </w:r>
         <w:r>
           <w:rPr>
@@ -252,7 +252,7 @@
           <w14:ligatures w14:val="standardContextual"/>
         </w:rPr>
       </w:pPr>
-      <w:hyperlink w:anchor="_Toc240812485" w:history="1">
+      <w:hyperlink w:anchor="_Toc240816112" w:history="1">
         <w:r>
           <w:rPr>
             <w:rStyle w:val="a5"/>
@@ -296,7 +296,7 @@
             <w:noProof/>
             <w:webHidden/>
           </w:rPr>
-          <w:instrText>PAGEREF _Toc240812485 \h</w:instrText>
+          <w:instrText>PAGEREF _Toc240816112 \h</w:instrText>
         </w:r>
         <w:r>
           <w:rPr>
@@ -349,7 +349,7 @@
           <w14:ligatures w14:val="standardContextual"/>
         </w:rPr>
       </w:pPr>
-      <w:hyperlink w:anchor="_Toc240812486" w:history="1">
+      <w:hyperlink w:anchor="_Toc240816113" w:history="1">
         <w:r>
           <w:rPr>
             <w:rStyle w:val="a5"/>
@@ -393,7 +393,7 @@
             <w:noProof/>
             <w:webHidden/>
           </w:rPr>
-          <w:instrText>PAGEREF _Toc240812486 \h</w:instrText>
+          <w:instrText>PAGEREF _Toc240816113 \h</w:instrText>
         </w:r>
         <w:r>
           <w:rPr>
@@ -447,7 +447,7 @@
           <w14:ligatures w14:val="standardContextual"/>
         </w:rPr>
       </w:pPr>
-      <w:hyperlink w:anchor="_Toc240812487" w:history="1">
+      <w:hyperlink w:anchor="_Toc240816114" w:history="1">
         <w:r>
           <w:rPr>
             <w:rStyle w:val="a5"/>
@@ -484,7 +484,7 @@
             <w:noProof/>
             <w:webHidden/>
           </w:rPr>
-          <w:instrText>PAGEREF _Toc240812487 \h</w:instrText>
+          <w:instrText>PAGEREF _Toc240816114 \h</w:instrText>
         </w:r>
         <w:r>
           <w:rPr>
@@ -538,7 +538,7 @@
           <w14:ligatures w14:val="standardContextual"/>
         </w:rPr>
       </w:pPr>
-      <w:hyperlink w:anchor="_Toc240812488" w:history="1">
+      <w:hyperlink w:anchor="_Toc240816115" w:history="1">
         <w:r>
           <w:rPr>
             <w:rStyle w:val="a5"/>
@@ -575,7 +575,7 @@
             <w:noProof/>
             <w:webHidden/>
           </w:rPr>
-          <w:instrText>PAGEREF _Toc240812488 \h</w:instrText>
+          <w:instrText>PAGEREF _Toc240816115 \h</w:instrText>
         </w:r>
         <w:r>
           <w:rPr>
@@ -629,7 +629,7 @@
           <w14:ligatures w14:val="standardContextual"/>
         </w:rPr>
       </w:pPr>
-      <w:hyperlink w:anchor="_Toc240812489" w:history="1">
+      <w:hyperlink w:anchor="_Toc240816116" w:history="1">
         <w:r>
           <w:rPr>
             <w:rStyle w:val="a5"/>
@@ -666,7 +666,7 @@
             <w:noProof/>
             <w:webHidden/>
           </w:rPr>
-          <w:instrText>PAGEREF _Toc240812489 \h</w:instrText>
+          <w:instrText>PAGEREF _Toc240816116 \h</w:instrText>
         </w:r>
         <w:r>
           <w:rPr>
@@ -719,7 +719,7 @@
           <w14:ligatures w14:val="standardContextual"/>
         </w:rPr>
       </w:pPr>
-      <w:hyperlink w:anchor="_Toc240812490" w:history="1">
+      <w:hyperlink w:anchor="_Toc240816117" w:history="1">
         <w:r>
           <w:rPr>
             <w:rStyle w:val="a5"/>
@@ -763,7 +763,7 @@
             <w:noProof/>
             <w:webHidden/>
           </w:rPr>
-          <w:instrText>PAGEREF _Toc240812490 \h</w:instrText>
+          <w:instrText>PAGEREF _Toc240816117 \h</w:instrText>
         </w:r>
         <w:r>
           <w:rPr>
@@ -817,7 +817,7 @@
           <w14:ligatures w14:val="standardContextual"/>
         </w:rPr>
       </w:pPr>
-      <w:hyperlink w:anchor="_Toc240812491" w:history="1">
+      <w:hyperlink w:anchor="_Toc240816118" w:history="1">
         <w:r>
           <w:rPr>
             <w:rStyle w:val="a5"/>
@@ -854,7 +854,7 @@
             <w:noProof/>
             <w:webHidden/>
           </w:rPr>
-          <w:instrText>PAGEREF _Toc240812491 \h</w:instrText>
+          <w:instrText>PAGEREF _Toc240816118 \h</w:instrText>
         </w:r>
         <w:r>
           <w:rPr>
@@ -908,7 +908,7 @@
           <w14:ligatures w14:val="standardContextual"/>
         </w:rPr>
       </w:pPr>
-      <w:hyperlink w:anchor="_Toc240812492" w:history="1">
+      <w:hyperlink w:anchor="_Toc240816119" w:history="1">
         <w:r>
           <w:rPr>
             <w:rStyle w:val="a5"/>
@@ -945,7 +945,7 @@
             <w:noProof/>
             <w:webHidden/>
           </w:rPr>
-          <w:instrText>PAGEREF _Toc240812492 \h</w:instrText>
+          <w:instrText>PAGEREF _Toc240816119 \h</w:instrText>
         </w:r>
         <w:r>
           <w:rPr>
@@ -999,7 +999,7 @@
           <w14:ligatures w14:val="standardContextual"/>
         </w:rPr>
       </w:pPr>
-      <w:hyperlink w:anchor="_Toc240812493" w:history="1">
+      <w:hyperlink w:anchor="_Toc240816120" w:history="1">
         <w:r>
           <w:rPr>
             <w:rStyle w:val="a5"/>
@@ -1036,7 +1036,7 @@
             <w:noProof/>
             <w:webHidden/>
           </w:rPr>
-          <w:instrText>PAGEREF _Toc240812493 \h</w:instrText>
+          <w:instrText>PAGEREF _Toc240816120 \h</w:instrText>
         </w:r>
         <w:r>
           <w:rPr>
@@ -1089,7 +1089,7 @@
           <w14:ligatures w14:val="standardContextual"/>
         </w:rPr>
       </w:pPr>
-      <w:hyperlink w:anchor="_Toc240812494" w:history="1">
+      <w:hyperlink w:anchor="_Toc240816121" w:history="1">
         <w:r>
           <w:rPr>
             <w:rStyle w:val="a5"/>
@@ -1133,7 +1133,7 @@
             <w:noProof/>
             <w:webHidden/>
           </w:rPr>
-          <w:instrText>PAGEREF _Toc240812494 \h</w:instrText>
+          <w:instrText>PAGEREF _Toc240816121 \h</w:instrText>
         </w:r>
         <w:r>
           <w:rPr>
@@ -1187,7 +1187,7 @@
           <w14:ligatures w14:val="standardContextual"/>
         </w:rPr>
       </w:pPr>
-      <w:hyperlink w:anchor="_Toc240812495" w:history="1">
+      <w:hyperlink w:anchor="_Toc240816122" w:history="1">
         <w:r>
           <w:rPr>
             <w:rStyle w:val="a5"/>
@@ -1231,7 +1231,7 @@
             <w:noProof/>
             <w:webHidden/>
           </w:rPr>
-          <w:instrText>PAGEREF _Toc240812495 \h</w:instrText>
+          <w:instrText>PAGEREF _Toc240816122 \h</w:instrText>
         </w:r>
         <w:r>
           <w:rPr>
@@ -1285,7 +1285,7 @@
           <w14:ligatures w14:val="standardContextual"/>
         </w:rPr>
       </w:pPr>
-      <w:hyperlink w:anchor="_Toc240812496" w:history="1">
+      <w:hyperlink w:anchor="_Toc240816123" w:history="1">
         <w:r>
           <w:rPr>
             <w:rStyle w:val="a5"/>
@@ -1322,7 +1322,7 @@
             <w:noProof/>
             <w:webHidden/>
           </w:rPr>
-          <w:instrText>PAGEREF _Toc240812496 \h</w:instrText>
+          <w:instrText>PAGEREF _Toc240816123 \h</w:instrText>
         </w:r>
         <w:r>
           <w:rPr>
@@ -1376,7 +1376,7 @@
           <w14:ligatures w14:val="standardContextual"/>
         </w:rPr>
       </w:pPr>
-      <w:hyperlink w:anchor="_Toc240812497" w:history="1">
+      <w:hyperlink w:anchor="_Toc240816124" w:history="1">
         <w:r>
           <w:rPr>
             <w:rStyle w:val="a5"/>
@@ -1413,7 +1413,7 @@
             <w:noProof/>
             <w:webHidden/>
           </w:rPr>
-          <w:instrText>PAGEREF _Toc240812497 \h</w:instrText>
+          <w:instrText>PAGEREF _Toc240816124 \h</w:instrText>
         </w:r>
         <w:r>
           <w:rPr>
@@ -1467,7 +1467,7 @@
           <w14:ligatures w14:val="standardContextual"/>
         </w:rPr>
       </w:pPr>
-      <w:hyperlink w:anchor="_Toc240812498" w:history="1">
+      <w:hyperlink w:anchor="_Toc240816125" w:history="1">
         <w:r>
           <w:rPr>
             <w:rStyle w:val="a5"/>
@@ -1504,7 +1504,7 @@
             <w:noProof/>
             <w:webHidden/>
           </w:rPr>
-          <w:instrText>PAGEREF _Toc240812498 \h</w:instrText>
+          <w:instrText>PAGEREF _Toc240816125 \h</w:instrText>
         </w:r>
         <w:r>
           <w:rPr>
@@ -1558,7 +1558,7 @@
           <w14:ligatures w14:val="standardContextual"/>
         </w:rPr>
       </w:pPr>
-      <w:hyperlink w:anchor="_Toc240812499" w:history="1">
+      <w:hyperlink w:anchor="_Toc240816126" w:history="1">
         <w:r>
           <w:rPr>
             <w:rStyle w:val="a5"/>
@@ -1595,7 +1595,7 @@
             <w:noProof/>
             <w:webHidden/>
           </w:rPr>
-          <w:instrText>PAGEREF _Toc240812499 \h</w:instrText>
+          <w:instrText>PAGEREF _Toc240816126 \h</w:instrText>
         </w:r>
         <w:r>
           <w:rPr>
@@ -1649,7 +1649,7 @@
           <w14:ligatures w14:val="standardContextual"/>
         </w:rPr>
       </w:pPr>
-      <w:hyperlink w:anchor="_Toc240812500" w:history="1">
+      <w:hyperlink w:anchor="_Toc240816127" w:history="1">
         <w:r>
           <w:rPr>
             <w:rStyle w:val="a5"/>
@@ -1707,7 +1707,7 @@
             <w:noProof/>
             <w:webHidden/>
           </w:rPr>
-          <w:instrText>PAGEREF _Toc240812500 \h</w:instrText>
+          <w:instrText>PAGEREF _Toc240816127 \h</w:instrText>
         </w:r>
         <w:r>
           <w:rPr>
@@ -1761,7 +1761,7 @@
           <w14:ligatures w14:val="standardContextual"/>
         </w:rPr>
       </w:pPr>
-      <w:hyperlink w:anchor="_Toc240812501" w:history="1">
+      <w:hyperlink w:anchor="_Toc240816128" w:history="1">
         <w:r>
           <w:rPr>
             <w:rStyle w:val="a5"/>
@@ -1805,7 +1805,7 @@
             <w:noProof/>
             <w:webHidden/>
           </w:rPr>
-          <w:instrText>PAGEREF _Toc240812501 \h</w:instrText>
+          <w:instrText>PAGEREF _Toc240816128 \h</w:instrText>
         </w:r>
         <w:r>
           <w:rPr>
@@ -1858,7 +1858,7 @@
           <w14:ligatures w14:val="standardContextual"/>
         </w:rPr>
       </w:pPr>
-      <w:hyperlink w:anchor="_Toc240812502" w:history="1">
+      <w:hyperlink w:anchor="_Toc240816129" w:history="1">
         <w:r>
           <w:rPr>
             <w:rStyle w:val="a5"/>
@@ -1902,7 +1902,7 @@
             <w:noProof/>
             <w:webHidden/>
           </w:rPr>
-          <w:instrText>PAGEREF _Toc240812502 \h</w:instrText>
+          <w:instrText>PAGEREF _Toc240816129 \h</w:instrText>
         </w:r>
         <w:r>
           <w:rPr>
@@ -1956,7 +1956,7 @@
           <w14:ligatures w14:val="standardContextual"/>
         </w:rPr>
       </w:pPr>
-      <w:hyperlink w:anchor="_Toc240812503" w:history="1">
+      <w:hyperlink w:anchor="_Toc240816130" w:history="1">
         <w:r>
           <w:rPr>
             <w:rStyle w:val="a5"/>
@@ -1993,7 +1993,7 @@
             <w:noProof/>
             <w:webHidden/>
           </w:rPr>
-          <w:instrText>PAGEREF _Toc240812503 \h</w:instrText>
+          <w:instrText>PAGEREF _Toc240816130 \h</w:instrText>
         </w:r>
         <w:r>
           <w:rPr>
@@ -2047,7 +2047,7 @@
           <w14:ligatures w14:val="standardContextual"/>
         </w:rPr>
       </w:pPr>
-      <w:hyperlink w:anchor="_Toc240812504" w:history="1">
+      <w:hyperlink w:anchor="_Toc240816131" w:history="1">
         <w:r>
           <w:rPr>
             <w:rStyle w:val="a5"/>
@@ -2084,7 +2084,7 @@
             <w:noProof/>
             <w:webHidden/>
           </w:rPr>
-          <w:instrText>PAGEREF _Toc240812504 \h</w:instrText>
+          <w:instrText>PAGEREF _Toc240816131 \h</w:instrText>
         </w:r>
         <w:r>
           <w:rPr>
@@ -2138,7 +2138,7 @@
           <w14:ligatures w14:val="standardContextual"/>
         </w:rPr>
       </w:pPr>
-      <w:hyperlink w:anchor="_Toc240812505" w:history="1">
+      <w:hyperlink w:anchor="_Toc240816132" w:history="1">
         <w:r>
           <w:rPr>
             <w:rStyle w:val="a5"/>
@@ -2175,7 +2175,7 @@
             <w:noProof/>
             <w:webHidden/>
           </w:rPr>
-          <w:instrText>PAGEREF _Toc240812505 \h</w:instrText>
+          <w:instrText>PAGEREF _Toc240816132 \h</w:instrText>
         </w:r>
         <w:r>
           <w:rPr>
@@ -2229,7 +2229,7 @@
           <w14:ligatures w14:val="standardContextual"/>
         </w:rPr>
       </w:pPr>
-      <w:hyperlink w:anchor="_Toc240812506" w:history="1">
+      <w:hyperlink w:anchor="_Toc240816133" w:history="1">
         <w:r>
           <w:rPr>
             <w:rStyle w:val="a5"/>
@@ -2273,7 +2273,7 @@
             <w:noProof/>
             <w:webHidden/>
           </w:rPr>
-          <w:instrText>PAGEREF _Toc240812506 \h</w:instrText>
+          <w:instrText>PAGEREF _Toc240816133 \h</w:instrText>
         </w:r>
         <w:r>
           <w:rPr>
@@ -2327,7 +2327,7 @@
           <w14:ligatures w14:val="standardContextual"/>
         </w:rPr>
       </w:pPr>
-      <w:hyperlink w:anchor="_Toc240812507" w:history="1">
+      <w:hyperlink w:anchor="_Toc240816134" w:history="1">
         <w:r>
           <w:rPr>
             <w:rStyle w:val="a5"/>
@@ -2364,7 +2364,7 @@
             <w:noProof/>
             <w:webHidden/>
           </w:rPr>
-          <w:instrText>PAGEREF _Toc240812507 \h</w:instrText>
+          <w:instrText>PAGEREF _Toc240816134 \h</w:instrText>
         </w:r>
         <w:r>
           <w:rPr>
@@ -2418,7 +2418,7 @@
           <w14:ligatures w14:val="standardContextual"/>
         </w:rPr>
       </w:pPr>
-      <w:hyperlink w:anchor="_Toc240812508" w:history="1">
+      <w:hyperlink w:anchor="_Toc240816135" w:history="1">
         <w:r>
           <w:rPr>
             <w:rStyle w:val="a5"/>
@@ -2455,7 +2455,7 @@
             <w:noProof/>
             <w:webHidden/>
           </w:rPr>
-          <w:instrText>PAGEREF _Toc240812508 \h</w:instrText>
+          <w:instrText>PAGEREF _Toc240816135 \h</w:instrText>
         </w:r>
         <w:r>
           <w:rPr>
@@ -2508,7 +2508,7 @@
           <w14:ligatures w14:val="standardContextual"/>
         </w:rPr>
       </w:pPr>
-      <w:hyperlink w:anchor="_Toc240812509" w:history="1">
+      <w:hyperlink w:anchor="_Toc240816136" w:history="1">
         <w:r>
           <w:rPr>
             <w:rStyle w:val="a5"/>
@@ -2552,7 +2552,7 @@
             <w:noProof/>
             <w:webHidden/>
           </w:rPr>
-          <w:instrText>PAGEREF _Toc240812509 \h</w:instrText>
+          <w:instrText>PAGEREF _Toc240816136 \h</w:instrText>
         </w:r>
         <w:r>
           <w:rPr>
@@ -2606,7 +2606,7 @@
           <w14:ligatures w14:val="standardContextual"/>
         </w:rPr>
       </w:pPr>
-      <w:hyperlink w:anchor="_Toc240812510" w:history="1">
+      <w:hyperlink w:anchor="_Toc240816137" w:history="1">
         <w:r>
           <w:rPr>
             <w:rStyle w:val="a5"/>
@@ -2643,7 +2643,7 @@
             <w:noProof/>
             <w:webHidden/>
           </w:rPr>
-          <w:instrText>PAGEREF _Toc240812510 \h</w:instrText>
+          <w:instrText>PAGEREF _Toc240816137 \h</w:instrText>
         </w:r>
         <w:r>
           <w:rPr>
@@ -2697,7 +2697,7 @@
           <w14:ligatures w14:val="standardContextual"/>
         </w:rPr>
       </w:pPr>
-      <w:hyperlink w:anchor="_Toc240812511" w:history="1">
+      <w:hyperlink w:anchor="_Toc240816138" w:history="1">
         <w:r>
           <w:rPr>
             <w:rStyle w:val="a5"/>
@@ -2734,7 +2734,7 @@
             <w:noProof/>
             <w:webHidden/>
           </w:rPr>
-          <w:instrText>PAGEREF _Toc240812511 \h</w:instrText>
+          <w:instrText>PAGEREF _Toc240816138 \h</w:instrText>
         </w:r>
         <w:r>
           <w:rPr>
@@ -2788,7 +2788,7 @@
           <w14:ligatures w14:val="standardContextual"/>
         </w:rPr>
       </w:pPr>
-      <w:hyperlink w:anchor="_Toc240812512" w:history="1">
+      <w:hyperlink w:anchor="_Toc240816139" w:history="1">
         <w:r>
           <w:rPr>
             <w:rStyle w:val="a5"/>
@@ -2832,7 +2832,7 @@
             <w:noProof/>
             <w:webHidden/>
           </w:rPr>
-          <w:instrText>PAGEREF _Toc240812512 \h</w:instrText>
+          <w:instrText>PAGEREF _Toc240816139 \h</w:instrText>
         </w:r>
         <w:r>
           <w:rPr>
@@ -2886,7 +2886,7 @@
           <w14:ligatures w14:val="standardContextual"/>
         </w:rPr>
       </w:pPr>
-      <w:hyperlink w:anchor="_Toc240812513" w:history="1">
+      <w:hyperlink w:anchor="_Toc240816140" w:history="1">
         <w:r>
           <w:rPr>
             <w:rStyle w:val="a5"/>
@@ -2923,7 +2923,7 @@
             <w:noProof/>
             <w:webHidden/>
           </w:rPr>
-          <w:instrText>PAGEREF _Toc240812513 \h</w:instrText>
+          <w:instrText>PAGEREF _Toc240816140 \h</w:instrText>
         </w:r>
         <w:r>
           <w:rPr>
@@ -2976,7 +2976,7 @@
           <w14:ligatures w14:val="standardContextual"/>
         </w:rPr>
       </w:pPr>
-      <w:hyperlink w:anchor="_Toc240812514" w:history="1">
+      <w:hyperlink w:anchor="_Toc240816141" w:history="1">
         <w:r>
           <w:rPr>
             <w:rStyle w:val="a5"/>
@@ -3020,7 +3020,7 @@
             <w:noProof/>
             <w:webHidden/>
           </w:rPr>
-          <w:instrText>PAGEREF _Toc240812514 \h</w:instrText>
+          <w:instrText>PAGEREF _Toc240816141 \h</w:instrText>
         </w:r>
         <w:r>
           <w:rPr>
@@ -3074,7 +3074,7 @@
           <w14:ligatures w14:val="standardContextual"/>
         </w:rPr>
       </w:pPr>
-      <w:hyperlink w:anchor="_Toc240812515" w:history="1">
+      <w:hyperlink w:anchor="_Toc240816142" w:history="1">
         <w:r>
           <w:rPr>
             <w:rStyle w:val="a5"/>
@@ -3111,7 +3111,7 @@
             <w:noProof/>
             <w:webHidden/>
           </w:rPr>
-          <w:instrText>PAGEREF _Toc240812515 \h</w:instrText>
+          <w:instrText>PAGEREF _Toc240816142 \h</w:instrText>
         </w:r>
         <w:r>
           <w:rPr>
@@ -3164,7 +3164,7 @@
           <w14:ligatures w14:val="standardContextual"/>
         </w:rPr>
       </w:pPr>
-      <w:hyperlink w:anchor="_Toc240812516" w:history="1">
+      <w:hyperlink w:anchor="_Toc240816143" w:history="1">
         <w:r>
           <w:rPr>
             <w:rStyle w:val="a5"/>
@@ -3208,7 +3208,7 @@
             <w:noProof/>
             <w:webHidden/>
           </w:rPr>
-          <w:instrText>PAGEREF _Toc240812516 \h</w:instrText>
+          <w:instrText>PAGEREF _Toc240816143 \h</w:instrText>
         </w:r>
         <w:r>
           <w:rPr>
@@ -3262,7 +3262,7 @@
           <w14:ligatures w14:val="standardContextual"/>
         </w:rPr>
       </w:pPr>
-      <w:hyperlink w:anchor="_Toc240812517" w:history="1">
+      <w:hyperlink w:anchor="_Toc240816144" w:history="1">
         <w:r>
           <w:rPr>
             <w:rStyle w:val="a5"/>
@@ -3299,7 +3299,7 @@
             <w:noProof/>
             <w:webHidden/>
           </w:rPr>
-          <w:instrText>PAGEREF _Toc240812517 \h</w:instrText>
+          <w:instrText>PAGEREF _Toc240816144 \h</w:instrText>
         </w:r>
         <w:r>
           <w:rPr>
@@ -3353,7 +3353,7 @@
           <w14:ligatures w14:val="standardContextual"/>
         </w:rPr>
       </w:pPr>
-      <w:hyperlink w:anchor="_Toc240812518" w:history="1">
+      <w:hyperlink w:anchor="_Toc240816145" w:history="1">
         <w:r>
           <w:rPr>
             <w:rStyle w:val="a5"/>
@@ -3390,7 +3390,7 @@
             <w:noProof/>
             <w:webHidden/>
           </w:rPr>
-          <w:instrText>PAGEREF _Toc240812518 \h</w:instrText>
+          <w:instrText>PAGEREF _Toc240816145 \h</w:instrText>
         </w:r>
         <w:r>
           <w:rPr>
@@ -3444,7 +3444,7 @@
           <w14:ligatures w14:val="standardContextual"/>
         </w:rPr>
       </w:pPr>
-      <w:hyperlink w:anchor="_Toc240812519" w:history="1">
+      <w:hyperlink w:anchor="_Toc240816146" w:history="1">
         <w:r>
           <w:rPr>
             <w:rStyle w:val="a5"/>
@@ -3481,7 +3481,7 @@
             <w:noProof/>
             <w:webHidden/>
           </w:rPr>
-          <w:instrText>PAGEREF _Toc240812519 \h</w:instrText>
+          <w:instrText>PAGEREF _Toc240816146 \h</w:instrText>
         </w:r>
         <w:r>
           <w:rPr>
@@ -3535,7 +3535,7 @@
           <w14:ligatures w14:val="standardContextual"/>
         </w:rPr>
       </w:pPr>
-      <w:hyperlink w:anchor="_Toc240812520" w:history="1">
+      <w:hyperlink w:anchor="_Toc240816147" w:history="1">
         <w:r>
           <w:rPr>
             <w:rStyle w:val="a5"/>
@@ -3572,7 +3572,7 @@
             <w:noProof/>
             <w:webHidden/>
           </w:rPr>
-          <w:instrText>PAGEREF _Toc240812520 \h</w:instrText>
+          <w:instrText>PAGEREF _Toc240816147 \h</w:instrText>
         </w:r>
         <w:r>
           <w:rPr>
@@ -3628,7 +3628,7 @@
         <w:pStyle w:val="1"/>
         <w:pageBreakBefore/>
       </w:pPr>
-      <w:bookmarkStart w:id="0" w:name="_Toc240812483"/>
+      <w:bookmarkStart w:id="0" w:name="_Toc240816110"/>
       <w:r>
         <w:lastRenderedPageBreak/>
         <w:t>1</w:t>
@@ -3925,7 +3925,7 @@
       <w:pPr>
         <w:pStyle w:val="1"/>
       </w:pPr>
-      <w:bookmarkStart w:id="1" w:name="_Toc240812484"/>
+      <w:bookmarkStart w:id="1" w:name="_Toc240816111"/>
       <w:r>
         <w:t>2</w:t>
       </w:r>
@@ -4062,7 +4062,7 @@
         <w:pStyle w:val="1"/>
         <w:pageBreakBefore/>
       </w:pPr>
-      <w:bookmarkStart w:id="2" w:name="_Toc240812485"/>
+      <w:bookmarkStart w:id="2" w:name="_Toc240816112"/>
       <w:r>
         <w:lastRenderedPageBreak/>
         <w:t>3</w:t>
@@ -4076,7 +4076,7 @@
       <w:pPr>
         <w:pStyle w:val="2"/>
       </w:pPr>
-      <w:bookmarkStart w:id="3" w:name="_Toc240812486"/>
+      <w:bookmarkStart w:id="3" w:name="_Toc240816113"/>
       <w:r>
         <w:t xml:space="preserve">3.1 </w:t>
       </w:r>
@@ -4089,7 +4089,7 @@
       <w:pPr>
         <w:pStyle w:val="3"/>
       </w:pPr>
-      <w:bookmarkStart w:id="4" w:name="_Toc240812487"/>
+      <w:bookmarkStart w:id="4" w:name="_Toc240816114"/>
       <w:r>
         <w:t>项目背景与问题定义</w:t>
       </w:r>
@@ -4172,7 +4172,7 @@
         </w:rPr>
         <w:lastRenderedPageBreak/>
         <w:drawing>
-          <wp:inline distT="0" distB="0" distL="0" distR="0" wp14:anchorId="4232DA15" wp14:editId="33E53A3C">
+          <wp:inline distT="0" distB="0" distL="0" distR="0" wp14:anchorId="4C547901" wp14:editId="5FB304DC">
             <wp:extent cx="4605070" cy="3453803"/>
             <wp:effectExtent l="0" t="0" r="0" b="0"/>
             <wp:docPr id="1" name="Picture 1" descr="图 1  官方邮寄的 STM32H750B-DK 运行 VelaGuard 首页"/>
@@ -4239,7 +4239,7 @@
       <w:pPr>
         <w:pStyle w:val="3"/>
       </w:pPr>
-      <w:bookmarkStart w:id="5" w:name="_Toc240812488"/>
+      <w:bookmarkStart w:id="5" w:name="_Toc240816115"/>
       <w:r>
         <w:t>技术难点</w:t>
       </w:r>
@@ -4498,7 +4498,7 @@
       <w:pPr>
         <w:pStyle w:val="3"/>
       </w:pPr>
-      <w:bookmarkStart w:id="6" w:name="_Toc240812489"/>
+      <w:bookmarkStart w:id="6" w:name="_Toc240816116"/>
       <w:r>
         <w:t>创新点</w:t>
       </w:r>
@@ -4676,7 +4676,7 @@
       <w:pPr>
         <w:pStyle w:val="2"/>
       </w:pPr>
-      <w:bookmarkStart w:id="7" w:name="_Toc240812490"/>
+      <w:bookmarkStart w:id="7" w:name="_Toc240816117"/>
       <w:r>
         <w:t xml:space="preserve">3.2 </w:t>
       </w:r>
@@ -4689,7 +4689,7 @@
       <w:pPr>
         <w:pStyle w:val="3"/>
       </w:pPr>
-      <w:bookmarkStart w:id="8" w:name="_Toc240812491"/>
+      <w:bookmarkStart w:id="8" w:name="_Toc240816118"/>
       <w:r>
         <w:t>系统总体架构</w:t>
       </w:r>
@@ -4791,7 +4791,7 @@
         </w:rPr>
         <w:lastRenderedPageBreak/>
         <w:drawing>
-          <wp:inline distT="0" distB="0" distL="0" distR="0" wp14:anchorId="7BF7EB22" wp14:editId="7104614C">
+          <wp:inline distT="0" distB="0" distL="0" distR="0" wp14:anchorId="71CE6288" wp14:editId="15A6E9DA">
             <wp:extent cx="5615940" cy="3275965"/>
             <wp:effectExtent l="0" t="0" r="0" b="0"/>
             <wp:docPr id="2" name="Picture 2" descr="图 2  系统总体架构：现场、板端与云端的职责分工"/>
@@ -4896,7 +4896,7 @@
         </w:rPr>
         <w:lastRenderedPageBreak/>
         <w:drawing>
-          <wp:inline distT="0" distB="0" distL="0" distR="0" wp14:anchorId="50159AD1" wp14:editId="67E127A7">
+          <wp:inline distT="0" distB="0" distL="0" distR="0" wp14:anchorId="3F662025" wp14:editId="4BEBFE03">
             <wp:extent cx="5615940" cy="4211955"/>
             <wp:effectExtent l="0" t="0" r="0" b="0"/>
             <wp:docPr id="3" name="Picture 3" descr="图 3  实物联调拓扑：网关、真实 Modbus 从站与总线模拟器"/>
@@ -4957,7 +4957,7 @@
       <w:pPr>
         <w:pStyle w:val="3"/>
       </w:pPr>
-      <w:bookmarkStart w:id="9" w:name="_Toc240812492"/>
+      <w:bookmarkStart w:id="9" w:name="_Toc240816119"/>
       <w:r>
         <w:t>方案论证与选型</w:t>
       </w:r>
@@ -5246,7 +5246,7 @@
       <w:pPr>
         <w:pStyle w:val="3"/>
       </w:pPr>
-      <w:bookmarkStart w:id="10" w:name="_Toc240812493"/>
+      <w:bookmarkStart w:id="10" w:name="_Toc240816120"/>
       <w:r>
         <w:t>关键模块设计</w:t>
       </w:r>
@@ -5990,7 +5990,7 @@
           <w:noProof/>
         </w:rPr>
         <w:drawing>
-          <wp:inline distT="0" distB="0" distL="0" distR="0" wp14:anchorId="43BB28CE" wp14:editId="7E193954">
+          <wp:inline distT="0" distB="0" distL="0" distR="0" wp14:anchorId="377C9960" wp14:editId="4214BB03">
             <wp:extent cx="5615940" cy="3182366"/>
             <wp:effectExtent l="0" t="0" r="0" b="0"/>
             <wp:docPr id="4" name="Picture 4" descr="图 4  板端首页：32 个点位的快照与状态栏"/>
@@ -6118,7 +6118,7 @@
       <w:pPr>
         <w:pStyle w:val="2"/>
       </w:pPr>
-      <w:bookmarkStart w:id="11" w:name="_Toc240812494"/>
+      <w:bookmarkStart w:id="11" w:name="_Toc240816121"/>
       <w:r>
         <w:lastRenderedPageBreak/>
         <w:t xml:space="preserve">3.3 </w:t>
@@ -6132,7 +6132,7 @@
       <w:pPr>
         <w:pStyle w:val="3"/>
       </w:pPr>
-      <w:bookmarkStart w:id="12" w:name="_Toc240812495"/>
+      <w:bookmarkStart w:id="12" w:name="_Toc240816122"/>
       <w:r>
         <w:t xml:space="preserve">openvelaClaw </w:t>
       </w:r>
@@ -6267,7 +6267,7 @@
       <w:pPr>
         <w:pStyle w:val="3"/>
       </w:pPr>
-      <w:bookmarkStart w:id="13" w:name="_Toc240812496"/>
+      <w:bookmarkStart w:id="13" w:name="_Toc240816123"/>
       <w:r>
         <w:t>阈值与离线的确定性判定</w:t>
       </w:r>
@@ -6452,7 +6452,7 @@
           <w:noProof/>
         </w:rPr>
         <w:drawing>
-          <wp:inline distT="0" distB="0" distL="0" distR="0" wp14:anchorId="28B94B32" wp14:editId="6786846B">
+          <wp:inline distT="0" distB="0" distL="0" distR="0" wp14:anchorId="30573257" wp14:editId="1C32FBB0">
             <wp:extent cx="5615940" cy="3182366"/>
             <wp:effectExtent l="0" t="0" r="0" b="0"/>
             <wp:docPr id="5" name="Picture 5" descr="图 5  离线判定由连续失败计数改为滑窗失败率"/>
@@ -6559,7 +6559,7 @@
         </w:rPr>
         <w:lastRenderedPageBreak/>
         <w:drawing>
-          <wp:inline distT="0" distB="0" distL="0" distR="0" wp14:anchorId="2E92F31C" wp14:editId="568544C6">
+          <wp:inline distT="0" distB="0" distL="0" distR="0" wp14:anchorId="6AEE5EBC" wp14:editId="55B53D4B">
             <wp:extent cx="5615940" cy="3619162"/>
             <wp:effectExtent l="0" t="0" r="0" b="0"/>
             <wp:docPr id="6" name="Picture 6" descr="图 6  本地安全环与点表人工确认闸门"/>
@@ -6614,7 +6614,7 @@
       <w:pPr>
         <w:pStyle w:val="3"/>
       </w:pPr>
-      <w:bookmarkStart w:id="14" w:name="_Toc240812497"/>
+      <w:bookmarkStart w:id="14" w:name="_Toc240816124"/>
       <w:r>
         <w:t>总线探查与寄存器解码</w:t>
       </w:r>
@@ -6730,7 +6730,7 @@
         </w:rPr>
         <w:lastRenderedPageBreak/>
         <w:drawing>
-          <wp:inline distT="0" distB="0" distL="0" distR="0" wp14:anchorId="51AC4455" wp14:editId="58C65A01">
+          <wp:inline distT="0" distB="0" distL="0" distR="0" wp14:anchorId="24FD4EC6" wp14:editId="24C3C451">
             <wp:extent cx="5615940" cy="2963968"/>
             <wp:effectExtent l="0" t="0" r="0" b="0"/>
             <wp:docPr id="7" name="Picture 7" descr="图 7  总线探查：从陌生总线到候选点表"/>
@@ -6903,7 +6903,7 @@
       <w:pPr>
         <w:pStyle w:val="3"/>
       </w:pPr>
-      <w:bookmarkStart w:id="15" w:name="_Toc240812498"/>
+      <w:bookmarkStart w:id="15" w:name="_Toc240816125"/>
       <w:r>
         <w:t>帧级质量统计与故障归因</w:t>
       </w:r>
@@ -6974,7 +6974,7 @@
       <w:pPr>
         <w:pStyle w:val="3"/>
       </w:pPr>
-      <w:bookmarkStart w:id="16" w:name="_Toc240812499"/>
+      <w:bookmarkStart w:id="16" w:name="_Toc240816126"/>
       <w:r>
         <w:t>掉电安全的配置提交</w:t>
       </w:r>
@@ -7020,7 +7020,7 @@
       <w:pPr>
         <w:pStyle w:val="3"/>
       </w:pPr>
-      <w:bookmarkStart w:id="17" w:name="_Toc240812500"/>
+      <w:bookmarkStart w:id="17" w:name="_Toc240816127"/>
       <w:r>
         <w:t xml:space="preserve">QSPI XIP </w:t>
       </w:r>
@@ -7127,7 +7127,7 @@
         </w:rPr>
         <w:lastRenderedPageBreak/>
         <w:drawing>
-          <wp:inline distT="0" distB="0" distL="0" distR="0" wp14:anchorId="4C77AC22" wp14:editId="2613710A">
+          <wp:inline distT="0" distB="0" distL="0" distR="0" wp14:anchorId="054F2EB9" wp14:editId="49C013C6">
             <wp:extent cx="5615940" cy="3369564"/>
             <wp:effectExtent l="0" t="0" r="0" b="0"/>
             <wp:docPr id="8" name="Picture 8" descr="图 8  QSPI 原地执行约束下的启动链与升级路径"/>
@@ -7182,7 +7182,7 @@
       <w:pPr>
         <w:pStyle w:val="3"/>
       </w:pPr>
-      <w:bookmarkStart w:id="18" w:name="_Toc240812501"/>
+      <w:bookmarkStart w:id="18" w:name="_Toc240816128"/>
       <w:r>
         <w:t xml:space="preserve">openvela </w:t>
       </w:r>
@@ -7489,7 +7489,7 @@
       <w:pPr>
         <w:pStyle w:val="2"/>
       </w:pPr>
-      <w:bookmarkStart w:id="19" w:name="_Toc240812502"/>
+      <w:bookmarkStart w:id="19" w:name="_Toc240816129"/>
       <w:r>
         <w:t xml:space="preserve">3.4 </w:t>
       </w:r>
@@ -7502,7 +7502,7 @@
       <w:pPr>
         <w:pStyle w:val="3"/>
       </w:pPr>
-      <w:bookmarkStart w:id="20" w:name="_Toc240812503"/>
+      <w:bookmarkStart w:id="20" w:name="_Toc240816130"/>
       <w:r>
         <w:t>软件架构与启动</w:t>
       </w:r>
@@ -7949,7 +7949,7 @@
       <w:pPr>
         <w:pStyle w:val="3"/>
       </w:pPr>
-      <w:bookmarkStart w:id="21" w:name="_Toc240812504"/>
+      <w:bookmarkStart w:id="21" w:name="_Toc240816131"/>
       <w:r>
         <w:lastRenderedPageBreak/>
         <w:t>四条数据路径</w:t>
@@ -7968,7 +7968,7 @@
           <w:noProof/>
         </w:rPr>
         <w:drawing>
-          <wp:inline distT="0" distB="0" distL="0" distR="0" wp14:anchorId="52E45A8F" wp14:editId="1D72F632">
+          <wp:inline distT="0" distB="0" distL="0" distR="0" wp14:anchorId="68C35EFB" wp14:editId="2A1FAB09">
             <wp:extent cx="5615940" cy="4820348"/>
             <wp:effectExtent l="0" t="0" r="0" b="0"/>
             <wp:docPr id="9" name="Picture 9" descr="图 9  本地告警、联网解释、运行报告与云端留存的数据路径"/>
@@ -8383,7 +8383,7 @@
       <w:pPr>
         <w:pStyle w:val="3"/>
       </w:pPr>
-      <w:bookmarkStart w:id="22" w:name="_Toc240812505"/>
+      <w:bookmarkStart w:id="22" w:name="_Toc240816132"/>
       <w:r>
         <w:lastRenderedPageBreak/>
         <w:t>硬件设计与适配</w:t>
@@ -8915,7 +8915,7 @@
         </w:rPr>
         <w:lastRenderedPageBreak/>
         <w:drawing>
-          <wp:inline distT="0" distB="0" distL="0" distR="0" wp14:anchorId="5E5B9243" wp14:editId="7A06F3B8">
+          <wp:inline distT="0" distB="0" distL="0" distR="0" wp14:anchorId="1BF148AC" wp14:editId="127D9E24">
             <wp:extent cx="5615940" cy="2745571"/>
             <wp:effectExtent l="0" t="0" r="0" b="0"/>
             <wp:docPr id="10" name="Picture 10" descr="图 10  扩展板接口与接线（自绘，引脚级映射）"/>
@@ -8978,7 +8978,7 @@
           <w:noProof/>
         </w:rPr>
         <w:drawing>
-          <wp:inline distT="0" distB="0" distL="0" distR="0" wp14:anchorId="77C0E2CF" wp14:editId="3DCA20E7">
+          <wp:inline distT="0" distB="0" distL="0" distR="0" wp14:anchorId="782892A2" wp14:editId="478E3C99">
             <wp:extent cx="3369563" cy="4053609"/>
             <wp:effectExtent l="0" t="0" r="0" b="0"/>
             <wp:docPr id="11" name="Picture 11" descr="图 11  扩展板实物：STMOD+ 接口、DO 告警输出、ESP-01S 接口与 RS485 端子"/>
@@ -9066,7 +9066,7 @@
         </w:rPr>
         <w:lastRenderedPageBreak/>
         <w:drawing>
-          <wp:inline distT="0" distB="0" distL="0" distR="0" wp14:anchorId="0E5D0195" wp14:editId="2112656E">
+          <wp:inline distT="0" distB="0" distL="0" distR="0" wp14:anchorId="36B79B37" wp14:editId="3CCA5A75">
             <wp:extent cx="4605070" cy="3453803"/>
             <wp:effectExtent l="0" t="0" r="0" b="0"/>
             <wp:docPr id="12" name="Picture 12" descr="图 12  扩展板与主板的叠插关系"/>
@@ -9225,7 +9225,7 @@
         </w:rPr>
         <w:lastRenderedPageBreak/>
         <w:drawing>
-          <wp:inline distT="0" distB="0" distL="0" distR="0" wp14:anchorId="59C9FE8E" wp14:editId="3537865F">
+          <wp:inline distT="0" distB="0" distL="0" distR="0" wp14:anchorId="39FD0D4D" wp14:editId="3BF411CC">
             <wp:extent cx="4492752" cy="3179870"/>
             <wp:effectExtent l="0" t="0" r="0" b="0"/>
             <wp:docPr id="13" name="Picture 13" descr="图 13  扩展板原理图：RS485 收发与总线保护、数字量输出与电源"/>
@@ -9294,7 +9294,7 @@
           <w:noProof/>
         </w:rPr>
         <w:drawing>
-          <wp:inline distT="0" distB="0" distL="0" distR="0" wp14:anchorId="2E2ABCDC" wp14:editId="389C0F4D">
+          <wp:inline distT="0" distB="0" distL="0" distR="0" wp14:anchorId="1D5B9C3F" wp14:editId="5E85EE42">
             <wp:extent cx="2695651" cy="3594202"/>
             <wp:effectExtent l="0" t="0" r="0" b="0"/>
             <wp:docPr id="14" name="Picture 14" descr="图 14  扩展板 PCB 布局"/>
@@ -10265,7 +10265,7 @@
       <w:pPr>
         <w:pStyle w:val="3"/>
       </w:pPr>
-      <w:bookmarkStart w:id="23" w:name="_Toc240812506"/>
+      <w:bookmarkStart w:id="23" w:name="_Toc240816133"/>
       <w:r>
         <w:t>交互与设备</w:t>
       </w:r>
@@ -10364,7 +10364,7 @@
         </w:rPr>
         <w:lastRenderedPageBreak/>
         <w:drawing>
-          <wp:inline distT="0" distB="0" distL="0" distR="0" wp14:anchorId="5603CC78" wp14:editId="6AC80D14">
+          <wp:inline distT="0" distB="0" distL="0" distR="0" wp14:anchorId="53123DDB" wp14:editId="7DDBD944">
             <wp:extent cx="5615940" cy="3182366"/>
             <wp:effectExtent l="0" t="0" r="0" b="0"/>
             <wp:docPr id="15" name="Picture 15" descr="图 15  告警页：三行活动告警与逐点静音、标记处理"/>
@@ -10427,7 +10427,7 @@
           <w:noProof/>
         </w:rPr>
         <w:drawing>
-          <wp:inline distT="0" distB="0" distL="0" distR="0" wp14:anchorId="17AAB147" wp14:editId="0A5FB1C2">
+          <wp:inline distT="0" distB="0" distL="0" distR="0" wp14:anchorId="762AF651" wp14:editId="693881ED">
             <wp:extent cx="5615940" cy="3182366"/>
             <wp:effectExtent l="0" t="0" r="0" b="0"/>
             <wp:docPr id="16" name="Picture 16" descr="图 16  趋势页：阈值线与历史窗口切换"/>
@@ -11024,7 +11024,7 @@
       <w:pPr>
         <w:pStyle w:val="3"/>
       </w:pPr>
-      <w:bookmarkStart w:id="24" w:name="_Toc240812507"/>
+      <w:bookmarkStart w:id="24" w:name="_Toc240816134"/>
       <w:r>
         <w:t>配套项目：上位机与云看板</w:t>
       </w:r>
@@ -11133,7 +11133,7 @@
         </w:rPr>
         <w:lastRenderedPageBreak/>
         <w:drawing>
-          <wp:inline distT="0" distB="0" distL="0" distR="0" wp14:anchorId="14332576" wp14:editId="0930EC5F">
+          <wp:inline distT="0" distB="0" distL="0" distR="0" wp14:anchorId="37DD4EB8" wp14:editId="4021B8B8">
             <wp:extent cx="5615940" cy="3982898"/>
             <wp:effectExtent l="0" t="0" r="0" b="0"/>
             <wp:docPr id="17" name="Picture 17" descr="图 17  点表配置上位机：编辑、试读与人工确认"/>
@@ -11298,7 +11298,7 @@
         </w:rPr>
         <w:lastRenderedPageBreak/>
         <w:drawing>
-          <wp:inline distT="0" distB="0" distL="0" distR="0" wp14:anchorId="34E8BD72" wp14:editId="5FB89C73">
+          <wp:inline distT="0" distB="0" distL="0" distR="0" wp14:anchorId="68B83672" wp14:editId="7E0D97D1">
             <wp:extent cx="5335143" cy="2750933"/>
             <wp:effectExtent l="0" t="0" r="0" b="0"/>
             <wp:docPr id="18" name="Picture 18" descr="图 18  云看板设备总览：在线设备、活动告警与报文采集校验"/>
@@ -11361,7 +11361,7 @@
           <w:noProof/>
         </w:rPr>
         <w:drawing>
-          <wp:inline distT="0" distB="0" distL="0" distR="0" wp14:anchorId="4856C00B" wp14:editId="43123EC9">
+          <wp:inline distT="0" distB="0" distL="0" distR="0" wp14:anchorId="6A86160C" wp14:editId="3508C492">
             <wp:extent cx="5335143" cy="2750933"/>
             <wp:effectExtent l="0" t="0" r="0" b="0"/>
             <wp:docPr id="19" name="Picture 19" descr="图 19  云看板设备实时数据页：点位状态、总线地址、寄存器与阈值；该页取自已确认点表的联调样例，部分点位未接真实从站，故显示离线"/>
@@ -11447,7 +11447,7 @@
       <w:pPr>
         <w:pStyle w:val="3"/>
       </w:pPr>
-      <w:bookmarkStart w:id="25" w:name="_Toc240812508"/>
+      <w:bookmarkStart w:id="25" w:name="_Toc240816135"/>
       <w:r>
         <w:lastRenderedPageBreak/>
         <w:t>复现入口</w:t>
@@ -11602,7 +11602,7 @@
         <w:pStyle w:val="2"/>
         <w:pageBreakBefore/>
       </w:pPr>
-      <w:bookmarkStart w:id="26" w:name="_Toc240812509"/>
+      <w:bookmarkStart w:id="26" w:name="_Toc240816136"/>
       <w:r>
         <w:lastRenderedPageBreak/>
         <w:t xml:space="preserve">3.5 </w:t>
@@ -11616,7 +11616,7 @@
       <w:pPr>
         <w:pStyle w:val="3"/>
       </w:pPr>
-      <w:bookmarkStart w:id="27" w:name="_Toc240812510"/>
+      <w:bookmarkStart w:id="27" w:name="_Toc240816137"/>
       <w:r>
         <w:t>测试环境与证据范围</w:t>
       </w:r>
@@ -13086,7 +13086,7 @@
       <w:pPr>
         <w:pStyle w:val="3"/>
       </w:pPr>
-      <w:bookmarkStart w:id="28" w:name="_Toc240812511"/>
+      <w:bookmarkStart w:id="28" w:name="_Toc240816138"/>
       <w:r>
         <w:lastRenderedPageBreak/>
         <w:t>带屏静止首页性能</w:t>
@@ -13715,7 +13715,7 @@
       <w:pPr>
         <w:pStyle w:val="3"/>
       </w:pPr>
-      <w:bookmarkStart w:id="29" w:name="_Toc240812512"/>
+      <w:bookmarkStart w:id="29" w:name="_Toc240816139"/>
       <w:r>
         <w:t xml:space="preserve">openvelaClaw </w:t>
       </w:r>
@@ -14201,7 +14201,7 @@
       <w:pPr>
         <w:pStyle w:val="3"/>
       </w:pPr>
-      <w:bookmarkStart w:id="30" w:name="_Toc240812513"/>
+      <w:bookmarkStart w:id="30" w:name="_Toc240816140"/>
       <w:r>
         <w:lastRenderedPageBreak/>
         <w:t>可靠性与稳定性</w:t>
@@ -14266,7 +14266,7 @@
       <w:pPr>
         <w:pStyle w:val="2"/>
       </w:pPr>
-      <w:bookmarkStart w:id="31" w:name="_Toc240812514"/>
+      <w:bookmarkStart w:id="31" w:name="_Toc240816141"/>
       <w:r>
         <w:t xml:space="preserve">3.6 AI-Native </w:t>
       </w:r>
@@ -14885,7 +14885,7 @@
       <w:pPr>
         <w:pStyle w:val="3"/>
       </w:pPr>
-      <w:bookmarkStart w:id="32" w:name="_Toc240812515"/>
+      <w:bookmarkStart w:id="32" w:name="_Toc240816142"/>
       <w:r>
         <w:t>开发方式与经验</w:t>
       </w:r>
@@ -14980,7 +14980,7 @@
       <w:pPr>
         <w:pStyle w:val="2"/>
       </w:pPr>
-      <w:bookmarkStart w:id="33" w:name="_Toc240812516"/>
+      <w:bookmarkStart w:id="33" w:name="_Toc240816143"/>
       <w:r>
         <w:t xml:space="preserve">3.7 </w:t>
       </w:r>
@@ -14993,7 +14993,7 @@
       <w:pPr>
         <w:pStyle w:val="3"/>
       </w:pPr>
-      <w:bookmarkStart w:id="34" w:name="_Toc240812517"/>
+      <w:bookmarkStart w:id="34" w:name="_Toc240816144"/>
       <w:r>
         <w:t>成果总结</w:t>
       </w:r>
@@ -15113,7 +15113,7 @@
       <w:pPr>
         <w:pStyle w:val="3"/>
       </w:pPr>
-      <w:bookmarkStart w:id="35" w:name="_Toc240812518"/>
+      <w:bookmarkStart w:id="35" w:name="_Toc240816145"/>
       <w:r>
         <w:lastRenderedPageBreak/>
         <w:t>应用前景与商业价值</w:t>
@@ -15165,7 +15165,7 @@
       <w:pPr>
         <w:pStyle w:val="3"/>
       </w:pPr>
-      <w:bookmarkStart w:id="36" w:name="_Toc240812519"/>
+      <w:bookmarkStart w:id="36" w:name="_Toc240816146"/>
       <w:r>
         <w:t>不足与后续重点</w:t>
       </w:r>
@@ -15606,7 +15606,7 @@
       <w:pPr>
         <w:pStyle w:val="3"/>
       </w:pPr>
-      <w:bookmarkStart w:id="37" w:name="_Toc240812520"/>
+      <w:bookmarkStart w:id="37" w:name="_Toc240816147"/>
       <w:r>
         <w:lastRenderedPageBreak/>
         <w:t>实现与证据索引</w:t>
@@ -16838,9 +16838,9 @@
 <file path=word/numbering.xml><?xml version="1.0" encoding="utf-8"?>
 <w:numbering xmlns:wpc="http://schemas.microsoft.com/office/word/2010/wordprocessingCanvas" xmlns:cx="http://schemas.microsoft.com/office/drawing/2014/chartex" xmlns:cx1="http://schemas.microsoft.com/office/drawing/2015/9/8/chartex" xmlns:cx2="http://schemas.microsoft.com/office/drawing/2015/10/21/chartex" xmlns:cx3="http://schemas.microsoft.com/office/drawing/2016/5/9/chartex" xmlns:cx4="http://schemas.microsoft.com/office/drawing/2016/5/10/chartex" xmlns:cx5="http://schemas.microsoft.com/office/drawing/2016/5/11/chartex" xmlns:cx6="http://schemas.microsoft.com/office/drawing/2016/5/12/chartex" xmlns:cx7="http://schemas.microsoft.com/office/drawing/2016/5/13/chartex" xmlns:cx8="http://schemas.microsoft.com/office/drawing/2016/5/14/chartex" xmlns:mc="http://schemas.openxmlformats.org/markup-compatibility/2006" xmlns:aink="http://schemas.microsoft.com/office/drawing/2016/ink" xmlns:am3d="http://schemas.microsoft.com/office/drawing/2017/model3d" xmlns:o="urn:schemas-microsoft-com:office:office" xmlns:oel="http://schemas.microsoft.com/office/2019/extlst" xmlns:r="http://schemas.openxmlformats.org/officeDocument/2006/relationships" xmlns:m="http://schemas.openxmlformats.org/officeDocument/2006/math" xmlns:v="urn:schemas-microsoft-com:vml" xmlns:wp14="http://schemas.microsoft.com/office/word/2010/wordprocessingDrawing" xmlns:wp="http://schemas.openxmlformats.org/drawingml/2006/wordprocessingDrawing" xmlns:w10="urn:schemas-microsoft-com:office:word" xmlns:w="http://schemas.openxmlformats.org/wordprocessingml/2006/main" xmlns:w14="http://schemas.microsoft.com/office/word/2010/wordml" xmlns:w15="http://schemas.microsoft.com/office/word/2012/wordml" xmlns:w16cex="http://schemas.microsoft.com/office/word/2018/wordml/cex" xmlns:w16cid="http://schemas.microsoft.com/office/word/2016/wordml/cid" xmlns:w16="http://schemas.microsoft.com/office/word/2018/wordml" xmlns:w16du="http://schemas.microsoft.com/office/word/2023/wordml/word16du" xmlns:w16sdtdh="http://schemas.microsoft.com/office/word/2020/wordml/sdtdatahash" xmlns:w16sdtfl="http://schemas.microsoft.com/office/word/2024/wordml/sdtformatlock" xmlns:w16se="http://schemas.microsoft.com/office/word/2015/wordml/symex" xmlns:wpg="http://schemas.microsoft.com/office/word/2010/wordprocessingGroup" xmlns:wpi="http://schemas.microsoft.com/office/word/2010/wordprocessingInk" xmlns:wne="http://schemas.microsoft.com/office/word/2006/wordml" xmlns:wps="http://schemas.microsoft.com/office/word/2010/wordprocessingShape" mc:Ignorable="w14 w15 w16se w16cid w16 w16cex w16sdtdh w16sdtfl w16du wp14">
   <w:abstractNum w:abstractNumId="0" w15:restartNumberingAfterBreak="0">
-    <w:nsid w:val="042A632E"/>
+    <w:nsid w:val="152C5BF2"/>
     <w:multiLevelType w:val="multilevel"/>
-    <w:tmpl w:val="2D5810E8"/>
+    <w:tmpl w:val="404E66D2"/>
     <w:lvl w:ilvl="0">
       <w:numFmt w:val="bullet"/>
       <w:lvlText w:val="•"/>
@@ -16891,9 +16891,9 @@
     </w:lvl>
   </w:abstractNum>
   <w:abstractNum w:abstractNumId="1" w15:restartNumberingAfterBreak="0">
-    <w:nsid w:val="07003F04"/>
+    <w:nsid w:val="1834328C"/>
     <w:multiLevelType w:val="multilevel"/>
-    <w:tmpl w:val="6B96D5B4"/>
+    <w:tmpl w:val="C9E4D4E0"/>
     <w:lvl w:ilvl="0">
       <w:numFmt w:val="bullet"/>
       <w:lvlText w:val="•"/>
@@ -16944,9 +16944,9 @@
     </w:lvl>
   </w:abstractNum>
   <w:abstractNum w:abstractNumId="2" w15:restartNumberingAfterBreak="0">
-    <w:nsid w:val="0DB87D47"/>
+    <w:nsid w:val="218D68BF"/>
     <w:multiLevelType w:val="multilevel"/>
-    <w:tmpl w:val="AD6EDBAC"/>
+    <w:tmpl w:val="5AFCDDDE"/>
     <w:lvl w:ilvl="0">
       <w:numFmt w:val="bullet"/>
       <w:lvlText w:val="•"/>
@@ -16997,9 +16997,9 @@
     </w:lvl>
   </w:abstractNum>
   <w:abstractNum w:abstractNumId="3" w15:restartNumberingAfterBreak="0">
-    <w:nsid w:val="0E354079"/>
+    <w:nsid w:val="21AF7937"/>
     <w:multiLevelType w:val="multilevel"/>
-    <w:tmpl w:val="6B32DC84"/>
+    <w:tmpl w:val="FF8AF396"/>
     <w:lvl w:ilvl="0">
       <w:numFmt w:val="bullet"/>
       <w:lvlText w:val="•"/>
@@ -17050,9 +17050,9 @@
     </w:lvl>
   </w:abstractNum>
   <w:abstractNum w:abstractNumId="4" w15:restartNumberingAfterBreak="0">
-    <w:nsid w:val="0F5C67DD"/>
+    <w:nsid w:val="278F53B6"/>
     <w:multiLevelType w:val="multilevel"/>
-    <w:tmpl w:val="AB8238E6"/>
+    <w:tmpl w:val="7D56C7D4"/>
     <w:lvl w:ilvl="0">
       <w:numFmt w:val="bullet"/>
       <w:lvlText w:val="•"/>
@@ -17103,9 +17103,9 @@
     </w:lvl>
   </w:abstractNum>
   <w:abstractNum w:abstractNumId="5" w15:restartNumberingAfterBreak="0">
-    <w:nsid w:val="14B64BD5"/>
+    <w:nsid w:val="296C530A"/>
     <w:multiLevelType w:val="multilevel"/>
-    <w:tmpl w:val="CC8CA1FE"/>
+    <w:tmpl w:val="FF726462"/>
     <w:lvl w:ilvl="0">
       <w:numFmt w:val="bullet"/>
       <w:lvlText w:val="•"/>
@@ -17156,9 +17156,9 @@
     </w:lvl>
   </w:abstractNum>
   <w:abstractNum w:abstractNumId="6" w15:restartNumberingAfterBreak="0">
-    <w:nsid w:val="17F9648B"/>
+    <w:nsid w:val="2EE42A63"/>
     <w:multiLevelType w:val="multilevel"/>
-    <w:tmpl w:val="E75EB560"/>
+    <w:tmpl w:val="B2B68154"/>
     <w:lvl w:ilvl="0">
       <w:numFmt w:val="bullet"/>
       <w:lvlText w:val="•"/>
@@ -17209,9 +17209,9 @@
     </w:lvl>
   </w:abstractNum>
   <w:abstractNum w:abstractNumId="7" w15:restartNumberingAfterBreak="0">
-    <w:nsid w:val="1A933F74"/>
+    <w:nsid w:val="33893B6E"/>
     <w:multiLevelType w:val="multilevel"/>
-    <w:tmpl w:val="01E89B12"/>
+    <w:tmpl w:val="3ED27BFA"/>
     <w:lvl w:ilvl="0">
       <w:numFmt w:val="bullet"/>
       <w:lvlText w:val="•"/>
@@ -17262,9 +17262,9 @@
     </w:lvl>
   </w:abstractNum>
   <w:abstractNum w:abstractNumId="8" w15:restartNumberingAfterBreak="0">
-    <w:nsid w:val="1D404E06"/>
+    <w:nsid w:val="34EB4722"/>
     <w:multiLevelType w:val="multilevel"/>
-    <w:tmpl w:val="2780E1A4"/>
+    <w:tmpl w:val="728CEA10"/>
     <w:lvl w:ilvl="0">
       <w:numFmt w:val="bullet"/>
       <w:lvlText w:val="•"/>
@@ -17315,9 +17315,9 @@
     </w:lvl>
   </w:abstractNum>
   <w:abstractNum w:abstractNumId="9" w15:restartNumberingAfterBreak="0">
-    <w:nsid w:val="20F46422"/>
+    <w:nsid w:val="36006487"/>
     <w:multiLevelType w:val="multilevel"/>
-    <w:tmpl w:val="79008E8A"/>
+    <w:tmpl w:val="C9C88B2E"/>
     <w:lvl w:ilvl="0">
       <w:numFmt w:val="bullet"/>
       <w:lvlText w:val="•"/>
@@ -17368,9 +17368,9 @@
     </w:lvl>
   </w:abstractNum>
   <w:abstractNum w:abstractNumId="10" w15:restartNumberingAfterBreak="0">
-    <w:nsid w:val="3F8646BD"/>
+    <w:nsid w:val="36BF7355"/>
     <w:multiLevelType w:val="multilevel"/>
-    <w:tmpl w:val="FB441712"/>
+    <w:tmpl w:val="A6DE0DA2"/>
     <w:lvl w:ilvl="0">
       <w:numFmt w:val="bullet"/>
       <w:lvlText w:val="•"/>
@@ -17421,9 +17421,9 @@
     </w:lvl>
   </w:abstractNum>
   <w:abstractNum w:abstractNumId="11" w15:restartNumberingAfterBreak="0">
-    <w:nsid w:val="44BB079D"/>
+    <w:nsid w:val="3C276908"/>
     <w:multiLevelType w:val="multilevel"/>
-    <w:tmpl w:val="849E437E"/>
+    <w:tmpl w:val="2E74A88A"/>
     <w:lvl w:ilvl="0">
       <w:numFmt w:val="bullet"/>
       <w:lvlText w:val="•"/>
@@ -17474,9 +17474,9 @@
     </w:lvl>
   </w:abstractNum>
   <w:abstractNum w:abstractNumId="12" w15:restartNumberingAfterBreak="0">
-    <w:nsid w:val="4511675B"/>
+    <w:nsid w:val="44792997"/>
     <w:multiLevelType w:val="multilevel"/>
-    <w:tmpl w:val="A7ACE57E"/>
+    <w:tmpl w:val="6308BBF0"/>
     <w:lvl w:ilvl="0">
       <w:numFmt w:val="bullet"/>
       <w:lvlText w:val="•"/>
@@ -17527,9 +17527,9 @@
     </w:lvl>
   </w:abstractNum>
   <w:abstractNum w:abstractNumId="13" w15:restartNumberingAfterBreak="0">
-    <w:nsid w:val="453132E3"/>
+    <w:nsid w:val="46D474E9"/>
     <w:multiLevelType w:val="multilevel"/>
-    <w:tmpl w:val="D932F87C"/>
+    <w:tmpl w:val="BD76E9A0"/>
     <w:lvl w:ilvl="0">
       <w:numFmt w:val="bullet"/>
       <w:lvlText w:val="•"/>
@@ -17580,9 +17580,9 @@
     </w:lvl>
   </w:abstractNum>
   <w:abstractNum w:abstractNumId="14" w15:restartNumberingAfterBreak="0">
-    <w:nsid w:val="45ED4AD7"/>
+    <w:nsid w:val="48005B82"/>
     <w:multiLevelType w:val="multilevel"/>
-    <w:tmpl w:val="A04280E8"/>
+    <w:tmpl w:val="E004848E"/>
     <w:lvl w:ilvl="0">
       <w:numFmt w:val="bullet"/>
       <w:lvlText w:val="•"/>
@@ -17633,9 +17633,9 @@
     </w:lvl>
   </w:abstractNum>
   <w:abstractNum w:abstractNumId="15" w15:restartNumberingAfterBreak="0">
-    <w:nsid w:val="47CF018D"/>
+    <w:nsid w:val="4A641248"/>
     <w:multiLevelType w:val="multilevel"/>
-    <w:tmpl w:val="68723F18"/>
+    <w:tmpl w:val="13AACC28"/>
     <w:lvl w:ilvl="0">
       <w:numFmt w:val="bullet"/>
       <w:lvlText w:val="•"/>
@@ -17686,9 +17686,9 @@
     </w:lvl>
   </w:abstractNum>
   <w:abstractNum w:abstractNumId="16" w15:restartNumberingAfterBreak="0">
-    <w:nsid w:val="480A5F8F"/>
+    <w:nsid w:val="4F292381"/>
     <w:multiLevelType w:val="multilevel"/>
-    <w:tmpl w:val="11F418BC"/>
+    <w:tmpl w:val="8AF2CD20"/>
     <w:lvl w:ilvl="0">
       <w:numFmt w:val="bullet"/>
       <w:lvlText w:val="•"/>
@@ -17739,9 +17739,9 @@
     </w:lvl>
   </w:abstractNum>
   <w:abstractNum w:abstractNumId="17" w15:restartNumberingAfterBreak="0">
-    <w:nsid w:val="4D160911"/>
+    <w:nsid w:val="55EE5E8E"/>
     <w:multiLevelType w:val="multilevel"/>
-    <w:tmpl w:val="10B6731E"/>
+    <w:tmpl w:val="7AFC7BFA"/>
     <w:lvl w:ilvl="0">
       <w:numFmt w:val="bullet"/>
       <w:lvlText w:val="•"/>
@@ -17792,9 +17792,9 @@
     </w:lvl>
   </w:abstractNum>
   <w:abstractNum w:abstractNumId="18" w15:restartNumberingAfterBreak="0">
-    <w:nsid w:val="4E376479"/>
+    <w:nsid w:val="55F01650"/>
     <w:multiLevelType w:val="multilevel"/>
-    <w:tmpl w:val="7AA8DD8C"/>
+    <w:tmpl w:val="4C2EF4B8"/>
     <w:lvl w:ilvl="0">
       <w:numFmt w:val="bullet"/>
       <w:lvlText w:val="•"/>
@@ -17845,9 +17845,9 @@
     </w:lvl>
   </w:abstractNum>
   <w:abstractNum w:abstractNumId="19" w15:restartNumberingAfterBreak="0">
-    <w:nsid w:val="52C47D3E"/>
+    <w:nsid w:val="588406F6"/>
     <w:multiLevelType w:val="multilevel"/>
-    <w:tmpl w:val="03262700"/>
+    <w:tmpl w:val="585ACF80"/>
     <w:lvl w:ilvl="0">
       <w:numFmt w:val="bullet"/>
       <w:lvlText w:val="•"/>
@@ -17898,9 +17898,9 @@
     </w:lvl>
   </w:abstractNum>
   <w:abstractNum w:abstractNumId="20" w15:restartNumberingAfterBreak="0">
-    <w:nsid w:val="53C336A1"/>
+    <w:nsid w:val="5A8C63CC"/>
     <w:multiLevelType w:val="multilevel"/>
-    <w:tmpl w:val="1B82CC72"/>
+    <w:tmpl w:val="9258E848"/>
     <w:lvl w:ilvl="0">
       <w:numFmt w:val="bullet"/>
       <w:lvlText w:val="•"/>
@@ -17951,9 +17951,9 @@
     </w:lvl>
   </w:abstractNum>
   <w:abstractNum w:abstractNumId="21" w15:restartNumberingAfterBreak="0">
-    <w:nsid w:val="547F5AA4"/>
+    <w:nsid w:val="60EB5186"/>
     <w:multiLevelType w:val="multilevel"/>
-    <w:tmpl w:val="0E201D5A"/>
+    <w:tmpl w:val="B2B69082"/>
     <w:lvl w:ilvl="0">
       <w:numFmt w:val="bullet"/>
       <w:lvlText w:val="•"/>
@@ -18004,9 +18004,9 @@
     </w:lvl>
   </w:abstractNum>
   <w:abstractNum w:abstractNumId="22" w15:restartNumberingAfterBreak="0">
-    <w:nsid w:val="555C5F1D"/>
+    <w:nsid w:val="67A201F5"/>
     <w:multiLevelType w:val="multilevel"/>
-    <w:tmpl w:val="5F1C40EC"/>
+    <w:tmpl w:val="A3C8A534"/>
     <w:lvl w:ilvl="0">
       <w:numFmt w:val="bullet"/>
       <w:lvlText w:val="•"/>
@@ -18057,9 +18057,9 @@
     </w:lvl>
   </w:abstractNum>
   <w:abstractNum w:abstractNumId="23" w15:restartNumberingAfterBreak="0">
-    <w:nsid w:val="5A177B89"/>
+    <w:nsid w:val="6A9C3345"/>
     <w:multiLevelType w:val="multilevel"/>
-    <w:tmpl w:val="1A0A674A"/>
+    <w:tmpl w:val="5560D52C"/>
     <w:lvl w:ilvl="0">
       <w:numFmt w:val="bullet"/>
       <w:lvlText w:val="•"/>
@@ -18110,9 +18110,9 @@
     </w:lvl>
   </w:abstractNum>
   <w:abstractNum w:abstractNumId="24" w15:restartNumberingAfterBreak="0">
-    <w:nsid w:val="5AD72EA2"/>
+    <w:nsid w:val="717E3115"/>
     <w:multiLevelType w:val="multilevel"/>
-    <w:tmpl w:val="832A47E0"/>
+    <w:tmpl w:val="5CBAD91A"/>
     <w:lvl w:ilvl="0">
       <w:numFmt w:val="bullet"/>
       <w:lvlText w:val="•"/>
@@ -18163,9 +18163,9 @@
     </w:lvl>
   </w:abstractNum>
   <w:abstractNum w:abstractNumId="25" w15:restartNumberingAfterBreak="0">
-    <w:nsid w:val="5C3070D5"/>
+    <w:nsid w:val="7312410D"/>
     <w:multiLevelType w:val="multilevel"/>
-    <w:tmpl w:val="B85C1396"/>
+    <w:tmpl w:val="9E9A0B6A"/>
     <w:lvl w:ilvl="0">
       <w:numFmt w:val="bullet"/>
       <w:lvlText w:val="•"/>
@@ -18216,9 +18216,9 @@
     </w:lvl>
   </w:abstractNum>
   <w:abstractNum w:abstractNumId="26" w15:restartNumberingAfterBreak="0">
-    <w:nsid w:val="614322D3"/>
+    <w:nsid w:val="7A957677"/>
     <w:multiLevelType w:val="multilevel"/>
-    <w:tmpl w:val="7F4CEA32"/>
+    <w:tmpl w:val="1F72B442"/>
     <w:lvl w:ilvl="0">
       <w:numFmt w:val="bullet"/>
       <w:lvlText w:val="•"/>
@@ -18269,9 +18269,9 @@
     </w:lvl>
   </w:abstractNum>
   <w:abstractNum w:abstractNumId="27" w15:restartNumberingAfterBreak="0">
-    <w:nsid w:val="780F2D06"/>
+    <w:nsid w:val="7D087536"/>
     <w:multiLevelType w:val="multilevel"/>
-    <w:tmpl w:val="12AC9A52"/>
+    <w:tmpl w:val="F54049B6"/>
     <w:lvl w:ilvl="0">
       <w:numFmt w:val="bullet"/>
       <w:lvlText w:val="•"/>
@@ -18322,9 +18322,9 @@
     </w:lvl>
   </w:abstractNum>
   <w:abstractNum w:abstractNumId="28" w15:restartNumberingAfterBreak="0">
-    <w:nsid w:val="7B8C6DEE"/>
+    <w:nsid w:val="7EAF6485"/>
     <w:multiLevelType w:val="multilevel"/>
-    <w:tmpl w:val="274CDB62"/>
+    <w:tmpl w:val="144E7C86"/>
     <w:lvl w:ilvl="0">
       <w:numFmt w:val="bullet"/>
       <w:lvlText w:val="•"/>
@@ -18374,92 +18374,92 @@
       <w:lvlJc w:val="left"/>
     </w:lvl>
   </w:abstractNum>
-  <w:num w:numId="1" w16cid:durableId="1591964701">
+  <w:num w:numId="1" w16cid:durableId="1305963519">
+    <w:abstractNumId w:val="14"/>
+  </w:num>
+  <w:num w:numId="2" w16cid:durableId="1006984430">
+    <w:abstractNumId w:val="3"/>
+  </w:num>
+  <w:num w:numId="3" w16cid:durableId="1069964207">
+    <w:abstractNumId w:val="7"/>
+  </w:num>
+  <w:num w:numId="4" w16cid:durableId="1343821428">
+    <w:abstractNumId w:val="25"/>
+  </w:num>
+  <w:num w:numId="5" w16cid:durableId="2122843380">
+    <w:abstractNumId w:val="10"/>
+  </w:num>
+  <w:num w:numId="6" w16cid:durableId="2062173858">
+    <w:abstractNumId w:val="11"/>
+  </w:num>
+  <w:num w:numId="7" w16cid:durableId="154801164">
+    <w:abstractNumId w:val="20"/>
+  </w:num>
+  <w:num w:numId="8" w16cid:durableId="257367738">
+    <w:abstractNumId w:val="5"/>
+  </w:num>
+  <w:num w:numId="9" w16cid:durableId="932712922">
+    <w:abstractNumId w:val="12"/>
+  </w:num>
+  <w:num w:numId="10" w16cid:durableId="1112355561">
+    <w:abstractNumId w:val="0"/>
+  </w:num>
+  <w:num w:numId="11" w16cid:durableId="1199202280">
+    <w:abstractNumId w:val="21"/>
+  </w:num>
+  <w:num w:numId="12" w16cid:durableId="454954000">
+    <w:abstractNumId w:val="28"/>
+  </w:num>
+  <w:num w:numId="13" w16cid:durableId="279184422">
+    <w:abstractNumId w:val="1"/>
+  </w:num>
+  <w:num w:numId="14" w16cid:durableId="1299653716">
+    <w:abstractNumId w:val="4"/>
+  </w:num>
+  <w:num w:numId="15" w16cid:durableId="215286603">
+    <w:abstractNumId w:val="18"/>
+  </w:num>
+  <w:num w:numId="16" w16cid:durableId="55278150">
+    <w:abstractNumId w:val="6"/>
+  </w:num>
+  <w:num w:numId="17" w16cid:durableId="328220219">
+    <w:abstractNumId w:val="17"/>
+  </w:num>
+  <w:num w:numId="18" w16cid:durableId="87238964">
+    <w:abstractNumId w:val="9"/>
+  </w:num>
+  <w:num w:numId="19" w16cid:durableId="19820548">
+    <w:abstractNumId w:val="26"/>
+  </w:num>
+  <w:num w:numId="20" w16cid:durableId="1304113943">
+    <w:abstractNumId w:val="27"/>
+  </w:num>
+  <w:num w:numId="21" w16cid:durableId="1354847392">
+    <w:abstractNumId w:val="8"/>
+  </w:num>
+  <w:num w:numId="22" w16cid:durableId="915094265">
+    <w:abstractNumId w:val="13"/>
+  </w:num>
+  <w:num w:numId="23" w16cid:durableId="1590196812">
+    <w:abstractNumId w:val="24"/>
+  </w:num>
+  <w:num w:numId="24" w16cid:durableId="1140031271">
+    <w:abstractNumId w:val="23"/>
+  </w:num>
+  <w:num w:numId="25" w16cid:durableId="982928781">
+    <w:abstractNumId w:val="2"/>
+  </w:num>
+  <w:num w:numId="26" w16cid:durableId="238755320">
     <w:abstractNumId w:val="16"/>
   </w:num>
-  <w:num w:numId="2" w16cid:durableId="1681345503">
-    <w:abstractNumId w:val="4"/>
+  <w:num w:numId="27" w16cid:durableId="154344801">
+    <w:abstractNumId w:val="15"/>
   </w:num>
-  <w:num w:numId="3" w16cid:durableId="111218925">
-    <w:abstractNumId w:val="24"/>
-  </w:num>
-  <w:num w:numId="4" w16cid:durableId="283730443">
-    <w:abstractNumId w:val="3"/>
-  </w:num>
-  <w:num w:numId="5" w16cid:durableId="2030401179">
-    <w:abstractNumId w:val="7"/>
-  </w:num>
-  <w:num w:numId="6" w16cid:durableId="133761242">
-    <w:abstractNumId w:val="27"/>
-  </w:num>
-  <w:num w:numId="7" w16cid:durableId="989939402">
-    <w:abstractNumId w:val="22"/>
-  </w:num>
-  <w:num w:numId="8" w16cid:durableId="678040061">
-    <w:abstractNumId w:val="28"/>
-  </w:num>
-  <w:num w:numId="9" w16cid:durableId="1674870176">
-    <w:abstractNumId w:val="9"/>
-  </w:num>
-  <w:num w:numId="10" w16cid:durableId="1268003503">
-    <w:abstractNumId w:val="8"/>
-  </w:num>
-  <w:num w:numId="11" w16cid:durableId="782260947">
-    <w:abstractNumId w:val="21"/>
-  </w:num>
-  <w:num w:numId="12" w16cid:durableId="483084511">
-    <w:abstractNumId w:val="12"/>
-  </w:num>
-  <w:num w:numId="13" w16cid:durableId="334843831">
-    <w:abstractNumId w:val="14"/>
-  </w:num>
-  <w:num w:numId="14" w16cid:durableId="241377186">
-    <w:abstractNumId w:val="1"/>
-  </w:num>
-  <w:num w:numId="15" w16cid:durableId="13115492">
+  <w:num w:numId="28" w16cid:durableId="1015419089">
     <w:abstractNumId w:val="19"/>
   </w:num>
-  <w:num w:numId="16" w16cid:durableId="254050173">
-    <w:abstractNumId w:val="2"/>
-  </w:num>
-  <w:num w:numId="17" w16cid:durableId="664629372">
-    <w:abstractNumId w:val="26"/>
-  </w:num>
-  <w:num w:numId="18" w16cid:durableId="199361851">
-    <w:abstractNumId w:val="5"/>
-  </w:num>
-  <w:num w:numId="19" w16cid:durableId="1375352443">
-    <w:abstractNumId w:val="23"/>
-  </w:num>
-  <w:num w:numId="20" w16cid:durableId="62610872">
-    <w:abstractNumId w:val="17"/>
-  </w:num>
-  <w:num w:numId="21" w16cid:durableId="891311695">
-    <w:abstractNumId w:val="6"/>
-  </w:num>
-  <w:num w:numId="22" w16cid:durableId="1749109968">
-    <w:abstractNumId w:val="20"/>
-  </w:num>
-  <w:num w:numId="23" w16cid:durableId="548759591">
-    <w:abstractNumId w:val="0"/>
-  </w:num>
-  <w:num w:numId="24" w16cid:durableId="1898856732">
-    <w:abstractNumId w:val="15"/>
-  </w:num>
-  <w:num w:numId="25" w16cid:durableId="2095588518">
-    <w:abstractNumId w:val="11"/>
-  </w:num>
-  <w:num w:numId="26" w16cid:durableId="2031641374">
-    <w:abstractNumId w:val="25"/>
-  </w:num>
-  <w:num w:numId="27" w16cid:durableId="497379428">
-    <w:abstractNumId w:val="13"/>
-  </w:num>
-  <w:num w:numId="28" w16cid:durableId="1260869295">
-    <w:abstractNumId w:val="18"/>
-  </w:num>
-  <w:num w:numId="29" w16cid:durableId="919480532">
-    <w:abstractNumId w:val="10"/>
+  <w:num w:numId="29" w16cid:durableId="450321837">
+    <w:abstractNumId w:val="22"/>
   </w:num>
 </w:numbering>
 </file>
@@ -19132,7 +19132,7 @@
     <w:basedOn w:val="a0"/>
     <w:uiPriority w:val="99"/>
     <w:unhideWhenUsed/>
-    <w:rsid w:val="004B18C7"/>
+    <w:rsid w:val="007D372E"/>
     <w:rPr>
       <w:color w:val="467886" w:themeColor="hyperlink"/>
       <w:u w:val="single"/>

</xml_diff>